<commit_message>
docs: update PRD (remove med switch, remove rest in habits, add non-punitive celebration copy)
</commit_message>
<xml_diff>
--- a/PRD_기획명세서.docx
+++ b/PRD_기획명세서.docx
@@ -624,7 +624,7 @@
           <w:color w:val="2563EB"/>
           <w:sz w:val="24"/>
         </w:rPr>
-        <w:t>① 💊 복약 알림 강제 ON 정책 (Locked ON 🔒)</w:t>
+        <w:t>① 💊 복약 알림 상시 작동 정책 (스위치 배제 원칙)</w:t>
       </w:r>
     </w:p>
     <w:p>
@@ -656,7 +656,7 @@
           <w:color w:val="334155"/>
           <w:sz w:val="20"/>
         </w:rPr>
-        <w:t>복약 알림은 사용자가 임의로 끌 수 없도록(해제 불가) 강제 적용함.</w:t>
+        <w:t>복약 알림은 해제 불가한 앱의 필수 기본 기능으로 상시 작동함.</w:t>
       </w:r>
     </w:p>
     <w:p>
@@ -699,27 +699,36 @@
       <w:r>
         <w:rPr>
           <w:rFonts w:ascii="맑은 고딕" w:hAnsi="맑은 고딕" w:eastAsia="맑은 고딕"/>
-          <w:color w:val="334155"/>
-          <w:sz w:val="20"/>
-        </w:rPr>
-        <w:t xml:space="preserve">설정 화면 내 복약 알림 토글 스위치는 클릭 불가(Disabled) 상태로 고정하고, 탭 시 </w:t>
-      </w:r>
-      <w:r>
-        <w:rPr>
-          <w:rFonts w:ascii="맑은 고딕" w:hAnsi="맑은 고딕" w:eastAsia="맑은 고딕"/>
-          <w:i/>
-          <w:color w:val="334155"/>
-          <w:sz w:val="20"/>
-        </w:rPr>
-        <w:t>"약물의 안정적 치료 농도 유지를 위해 복약 알림은 끌 수 없습니다"</w:t>
-      </w:r>
-      <w:r>
-        <w:rPr>
-          <w:rFonts w:ascii="맑은 고딕" w:hAnsi="맑은 고딕" w:eastAsia="맑은 고딕"/>
-          <w:color w:val="334155"/>
-          <w:sz w:val="20"/>
-        </w:rPr>
-        <w:t xml:space="preserve"> 툴팁을 출력함.</w:t>
+          <w:b/>
+          <w:color w:val="334155"/>
+          <w:sz w:val="20"/>
+        </w:rPr>
+        <w:t>스위치 배제 UI 원칙</w:t>
+      </w:r>
+      <w:r>
+        <w:rPr>
+          <w:rFonts w:ascii="맑은 고딕" w:hAnsi="맑은 고딕" w:eastAsia="맑은 고딕"/>
+          <w:color w:val="334155"/>
+          <w:sz w:val="20"/>
+        </w:rPr>
+        <w:t xml:space="preserve">: 설정 화면에 비활성화된 토글 스위치(Disabled Toggle)를 배치하여 불필요한 시각적 거부감이나 "왜 안 꺼지지?"라는 혼란을 유발하지 않도록, </w:t>
+      </w:r>
+      <w:r>
+        <w:rPr>
+          <w:rFonts w:ascii="맑은 고딕" w:hAnsi="맑은 고딕" w:eastAsia="맑은 고딕"/>
+          <w:b/>
+          <w:color w:val="334155"/>
+          <w:sz w:val="20"/>
+        </w:rPr>
+        <w:t>복약 알림에는 토글 스위치 자체를 아예 만들지 않음.</w:t>
+      </w:r>
+      <w:r>
+        <w:rPr>
+          <w:rFonts w:ascii="맑은 고딕" w:hAnsi="맑은 고딕" w:eastAsia="맑은 고딕"/>
+          <w:color w:val="334155"/>
+          <w:sz w:val="20"/>
+        </w:rPr>
+        <w:t xml:space="preserve"> 대신 "필수 기본 복약 알림 (항상 켜짐)" 형태의 상시 안내 카드로 고지함. (사용자는 상단의 '알림 빈도 조절'을 통해 알림 수신 강도만을 조정함).</w:t>
       </w:r>
     </w:p>
     <w:p>
@@ -786,32 +795,139 @@
       <w:r>
         <w:rPr>
           <w:rFonts w:ascii="맑은 고딕" w:hAnsi="맑은 고딕" w:eastAsia="맑은 고딕"/>
-          <w:color w:val="334155"/>
-          <w:sz w:val="20"/>
-        </w:rPr>
-        <w:t xml:space="preserve">연속 성공(Streak) 강박 대신 </w:t>
-      </w:r>
-      <w:r>
-        <w:rPr>
-          <w:rFonts w:ascii="맑은 고딕" w:hAnsi="맑은 고딕" w:eastAsia="맑은 고딕"/>
-          <w:b/>
-          <w:color w:val="334155"/>
-          <w:sz w:val="20"/>
-        </w:rPr>
-        <w:t>'누적 접속 일수(Self-Monitoring)'</w:t>
-      </w:r>
-      <w:r>
-        <w:rPr>
-          <w:rFonts w:ascii="맑은 고딕" w:hAnsi="맑은 고딕" w:eastAsia="맑은 고딕"/>
-          <w:color w:val="334155"/>
-          <w:sz w:val="20"/>
-        </w:rPr>
-        <w:t xml:space="preserve"> 카운터를 메인 지표로 활용함.</w:t>
+          <w:b/>
+          <w:color w:val="334155"/>
+          <w:sz w:val="20"/>
+        </w:rPr>
+        <w:t>연속 기록 실패 강박 및 채찍질 멘트 전면 금지</w:t>
+      </w:r>
+      <w:r>
+        <w:rPr>
+          <w:rFonts w:ascii="맑은 고딕" w:hAnsi="맑은 고딕" w:eastAsia="맑은 고딕"/>
+          <w:color w:val="334155"/>
+          <w:sz w:val="20"/>
+        </w:rPr>
+        <w:t>: 실패 압박이나 연속 기록 리셋으로 사용자를 채찍질하는 방식은 특히 우울증·ADHD 환자에게 극심한 자책감과 앱 이탈(Churn)을 유발함.</w:t>
       </w:r>
     </w:p>
     <w:p>
       <w:pPr>
         <w:spacing w:before="30" w:after="30"/>
+        <w:ind w:left="720"/>
+      </w:pPr>
+      <w:r>
+        <w:rPr>
+          <w:rFonts w:ascii="맑은 고딕" w:hAnsi="맑은 고딕"/>
+          <w:b/>
+          <w:color w:val="6366F1"/>
+          <w:sz w:val="20"/>
+        </w:rPr>
+        <w:t xml:space="preserve">⁃ </w:t>
+      </w:r>
+      <w:r>
+        <w:rPr>
+          <w:rFonts w:ascii="맑은 고딕" w:hAnsi="맑은 고딕" w:eastAsia="맑은 고딕"/>
+          <w:color w:val="334155"/>
+          <w:sz w:val="20"/>
+        </w:rPr>
+        <w:t xml:space="preserve">❌ </w:t>
+      </w:r>
+      <w:r>
+        <w:rPr>
+          <w:rFonts w:ascii="맑은 고딕" w:hAnsi="맑은 고딕" w:eastAsia="맑은 고딕"/>
+          <w:b/>
+          <w:color w:val="334155"/>
+          <w:sz w:val="20"/>
+        </w:rPr>
+        <w:t>금지 문구</w:t>
+      </w:r>
+      <w:r>
+        <w:rPr>
+          <w:rFonts w:ascii="맑은 고딕" w:hAnsi="맑은 고딕" w:eastAsia="맑은 고딕"/>
+          <w:color w:val="334155"/>
+          <w:sz w:val="20"/>
+        </w:rPr>
+        <w:t xml:space="preserve">: </w:t>
+      </w:r>
+      <w:r>
+        <w:rPr>
+          <w:rFonts w:ascii="맑은 고딕" w:hAnsi="맑은 고딕" w:eastAsia="맑은 고딕"/>
+          <w:i/>
+          <w:color w:val="334155"/>
+          <w:sz w:val="20"/>
+        </w:rPr>
+        <w:t>"또 약 복용 잊으셨어요! 15일 연속 기록이 리셋됐어요"</w:t>
+      </w:r>
+    </w:p>
+    <w:p>
+      <w:pPr>
+        <w:spacing w:before="30" w:after="30"/>
+        <w:ind w:left="720"/>
+      </w:pPr>
+      <w:r>
+        <w:rPr>
+          <w:rFonts w:ascii="맑은 고딕" w:hAnsi="맑은 고딕"/>
+          <w:b/>
+          <w:color w:val="6366F1"/>
+          <w:sz w:val="20"/>
+        </w:rPr>
+        <w:t xml:space="preserve">⁃ </w:t>
+      </w:r>
+      <w:r>
+        <w:rPr>
+          <w:rFonts w:ascii="맑은 고딕" w:hAnsi="맑은 고딕" w:eastAsia="맑은 고딕"/>
+          <w:color w:val="334155"/>
+          <w:sz w:val="20"/>
+        </w:rPr>
+        <w:t xml:space="preserve">⭕ </w:t>
+      </w:r>
+      <w:r>
+        <w:rPr>
+          <w:rFonts w:ascii="맑은 고딕" w:hAnsi="맑은 고딕" w:eastAsia="맑은 고딕"/>
+          <w:b/>
+          <w:color w:val="334155"/>
+          <w:sz w:val="20"/>
+        </w:rPr>
+        <w:t>권장 축하 문구</w:t>
+      </w:r>
+      <w:r>
+        <w:rPr>
+          <w:rFonts w:ascii="맑은 고딕" w:hAnsi="맑은 고딕" w:eastAsia="맑은 고딕"/>
+          <w:color w:val="334155"/>
+          <w:sz w:val="20"/>
+        </w:rPr>
+        <w:t xml:space="preserve">: </w:t>
+      </w:r>
+      <w:r>
+        <w:rPr>
+          <w:rFonts w:ascii="맑은 고딕" w:hAnsi="맑은 고딕" w:eastAsia="맑은 고딕"/>
+          <w:i/>
+          <w:color w:val="334155"/>
+          <w:sz w:val="20"/>
+        </w:rPr>
+        <w:t>"이번 달에 벌써 15번이나 약 복용을 지키셨어요!"</w:t>
+      </w:r>
+      <w:r>
+        <w:rPr>
+          <w:rFonts w:ascii="맑은 고딕" w:hAnsi="맑은 고딕" w:eastAsia="맑은 고딕"/>
+          <w:color w:val="334155"/>
+          <w:sz w:val="20"/>
+        </w:rPr>
+        <w:t xml:space="preserve">, </w:t>
+      </w:r>
+      <w:r>
+        <w:rPr>
+          <w:rFonts w:ascii="맑은 고딕" w:hAnsi="맑은 고딕" w:eastAsia="맑은 고딕"/>
+          <w:i/>
+          <w:color w:val="334155"/>
+          <w:sz w:val="20"/>
+        </w:rPr>
+        <w:t>"절반이라도 실천한 것이 소중한 한 걸음이에요!"</w:t>
+      </w:r>
+    </w:p>
+    <w:p>
+      <w:pPr>
+        <w:spacing w:before="30" w:after="30"/>
         <w:ind w:left="360"/>
       </w:pPr>
       <w:r>
@@ -829,6 +945,46 @@
           <w:color w:val="334155"/>
           <w:sz w:val="20"/>
         </w:rPr>
+        <w:t xml:space="preserve">연속 성공(Streak) 강박 대신 </w:t>
+      </w:r>
+      <w:r>
+        <w:rPr>
+          <w:rFonts w:ascii="맑은 고딕" w:hAnsi="맑은 고딕" w:eastAsia="맑은 고딕"/>
+          <w:b/>
+          <w:color w:val="334155"/>
+          <w:sz w:val="20"/>
+        </w:rPr>
+        <w:t>'월간 누적 성공 일수(Self-Monitoring)'</w:t>
+      </w:r>
+      <w:r>
+        <w:rPr>
+          <w:rFonts w:ascii="맑은 고딕" w:hAnsi="맑은 고딕" w:eastAsia="맑은 고딕"/>
+          <w:color w:val="334155"/>
+          <w:sz w:val="20"/>
+        </w:rPr>
+        <w:t xml:space="preserve"> 카운터를 메인 긍정 지표로 활용함.</w:t>
+      </w:r>
+    </w:p>
+    <w:p>
+      <w:pPr>
+        <w:spacing w:before="30" w:after="30"/>
+        <w:ind w:left="360"/>
+      </w:pPr>
+      <w:r>
+        <w:rPr>
+          <w:rFonts w:ascii="맑은 고딕" w:hAnsi="맑은 고딕"/>
+          <w:b/>
+          <w:color w:val="6366F1"/>
+          <w:sz w:val="20"/>
+        </w:rPr>
+        <w:t xml:space="preserve">• </w:t>
+      </w:r>
+      <w:r>
+        <w:rPr>
+          <w:rFonts w:ascii="맑은 고딕" w:hAnsi="맑은 고딕" w:eastAsia="맑은 고딕"/>
+          <w:color w:val="334155"/>
+          <w:sz w:val="20"/>
+        </w:rPr>
         <w:t xml:space="preserve">건너뛴 기록에 대해서도 </w:t>
       </w:r>
       <w:r>
@@ -846,7 +1002,7 @@
           <w:color w:val="334155"/>
           <w:sz w:val="20"/>
         </w:rPr>
-        <w:t xml:space="preserve"> 형태의 중립적 피드백을 제공함.</w:t>
+        <w:t xml:space="preserve"> 형태의 중립적이고 안심을 주는 피드백을 제공함.</w:t>
       </w:r>
     </w:p>
     <w:p>
@@ -4939,7 +5095,7 @@
           <w:color w:val="334155"/>
           <w:sz w:val="21"/>
         </w:rPr>
-        <w:t>$$\text{대기 }(\bigcirc) \longrightarrow \text{완료 }(\CIRCLE) \longrightarrow \text{조금 완료 }(\LEFTcircle) \longrightarrow \text{오늘 쉬기 }(\text{⏸}) \longrightarrow \text{대기 }(\bigcirc)$$</w:t>
+        <w:t>$\text{대기 }(\bigcirc) \longrightarrow \text{완료 }(\CIRCLE) \longrightarrow \text{조금 완료 }(\LEFTcircle) \longrightarrow \text{대기 }(\bigcirc)$</w:t>
       </w:r>
     </w:p>
     <w:p>
@@ -5193,7 +5349,54 @@
           <w:color w:val="334155"/>
           <w:sz w:val="20"/>
         </w:rPr>
-        <w:t xml:space="preserve">나 </w:t>
+        <w:t>로 수정 가능 (되돌리기 보장).</w:t>
+      </w:r>
+    </w:p>
+    <w:p>
+      <w:pPr>
+        <w:spacing w:before="30" w:after="30"/>
+        <w:ind w:left="360"/>
+      </w:pPr>
+      <w:r>
+        <w:rPr>
+          <w:rFonts w:ascii="맑은 고딕" w:hAnsi="맑은 고딕"/>
+          <w:b/>
+          <w:color w:val="2563EB"/>
+          <w:sz w:val="20"/>
+        </w:rPr>
+        <w:t xml:space="preserve">3. </w:t>
+      </w:r>
+      <w:r>
+        <w:rPr>
+          <w:rFonts w:ascii="맑은 고딕" w:hAnsi="맑은 고딕" w:eastAsia="맑은 고딕"/>
+          <w:b/>
+          <w:color w:val="334155"/>
+          <w:sz w:val="20"/>
+        </w:rPr>
+        <w:t>상태 3: 신규 습관 추가 화면 (Habits screen - 습관 추가됨)</w:t>
+      </w:r>
+    </w:p>
+    <w:p>
+      <w:pPr>
+        <w:spacing w:before="30" w:after="30"/>
+        <w:ind w:left="720"/>
+      </w:pPr>
+      <w:r>
+        <w:rPr>
+          <w:rFonts w:ascii="맑은 고딕" w:hAnsi="맑은 고딕"/>
+          <w:b/>
+          <w:color w:val="6366F1"/>
+          <w:sz w:val="20"/>
+        </w:rPr>
+        <w:t xml:space="preserve">⁃ </w:t>
+      </w:r>
+      <w:r>
+        <w:rPr>
+          <w:rFonts w:ascii="맑은 고딕" w:hAnsi="맑은 고딕" w:eastAsia="맑은 고딕"/>
+          <w:color w:val="334155"/>
+          <w:sz w:val="20"/>
+        </w:rPr>
+        <w:t xml:space="preserve">모달에서 저장 완료 시 목록 최상단에 </w:t>
       </w:r>
       <w:r>
         <w:rPr>
@@ -5201,62 +5404,15 @@
           <w:color w:val="B42846"/>
           <w:sz w:val="19"/>
         </w:rPr>
-        <w:t>[오늘 쉬기]</w:t>
-      </w:r>
-      <w:r>
-        <w:rPr>
-          <w:rFonts w:ascii="맑은 고딕" w:hAnsi="맑은 고딕" w:eastAsia="맑은 고딕"/>
-          <w:color w:val="334155"/>
-          <w:sz w:val="20"/>
-        </w:rPr>
-        <w:t>로 수정 가능 (되돌리기 보장).</w:t>
-      </w:r>
-    </w:p>
-    <w:p>
-      <w:pPr>
-        <w:spacing w:before="30" w:after="30"/>
-        <w:ind w:left="360"/>
-      </w:pPr>
-      <w:r>
-        <w:rPr>
-          <w:rFonts w:ascii="맑은 고딕" w:hAnsi="맑은 고딕"/>
-          <w:b/>
-          <w:color w:val="2563EB"/>
-          <w:sz w:val="20"/>
-        </w:rPr>
-        <w:t xml:space="preserve">3. </w:t>
-      </w:r>
-      <w:r>
-        <w:rPr>
-          <w:rFonts w:ascii="맑은 고딕" w:hAnsi="맑은 고딕" w:eastAsia="맑은 고딕"/>
-          <w:b/>
-          <w:color w:val="334155"/>
-          <w:sz w:val="20"/>
-        </w:rPr>
-        <w:t>상태 3: 신규 습관 추가 화면 (Habits screen - 습관 추가됨)</w:t>
-      </w:r>
-    </w:p>
-    <w:p>
-      <w:pPr>
-        <w:spacing w:before="30" w:after="30"/>
-        <w:ind w:left="720"/>
-      </w:pPr>
-      <w:r>
-        <w:rPr>
-          <w:rFonts w:ascii="맑은 고딕" w:hAnsi="맑은 고딕"/>
-          <w:b/>
-          <w:color w:val="6366F1"/>
-          <w:sz w:val="20"/>
-        </w:rPr>
-        <w:t xml:space="preserve">⁃ </w:t>
-      </w:r>
-      <w:r>
-        <w:rPr>
-          <w:rFonts w:ascii="맑은 고딕" w:hAnsi="맑은 고딕" w:eastAsia="맑은 고딕"/>
-          <w:color w:val="334155"/>
-          <w:sz w:val="20"/>
-        </w:rPr>
-        <w:t xml:space="preserve">모달에서 저장 완료 시 목록 최상단에 </w:t>
+        <w:t>[NEW]</w:t>
+      </w:r>
+      <w:r>
+        <w:rPr>
+          <w:rFonts w:ascii="맑은 고딕" w:hAnsi="맑은 고딕" w:eastAsia="맑은 고딕"/>
+          <w:color w:val="334155"/>
+          <w:sz w:val="20"/>
+        </w:rPr>
+        <w:t xml:space="preserve"> 배지와 함께 새 카드(</w:t>
       </w:r>
       <w:r>
         <w:rPr>
@@ -5264,15 +5420,38 @@
           <w:color w:val="B42846"/>
           <w:sz w:val="19"/>
         </w:rPr>
-        <w:t>[NEW]</w:t>
-      </w:r>
-      <w:r>
-        <w:rPr>
-          <w:rFonts w:ascii="맑은 고딕" w:hAnsi="맑은 고딕" w:eastAsia="맑은 고딕"/>
-          <w:color w:val="334155"/>
-          <w:sz w:val="20"/>
-        </w:rPr>
-        <w:t xml:space="preserve"> 배지와 함께 새 카드(</w:t>
+        <w:t>책상 위 물 한 컵 ✨ · 언제든 1분이라도</w:t>
+      </w:r>
+      <w:r>
+        <w:rPr>
+          <w:rFonts w:ascii="맑은 고딕" w:hAnsi="맑은 고딕" w:eastAsia="맑은 고딕"/>
+          <w:color w:val="334155"/>
+          <w:sz w:val="20"/>
+        </w:rPr>
+        <w:t>) 즉시 삽입.</w:t>
+      </w:r>
+    </w:p>
+    <w:p>
+      <w:pPr>
+        <w:spacing w:before="30" w:after="30"/>
+        <w:ind w:left="720"/>
+      </w:pPr>
+      <w:r>
+        <w:rPr>
+          <w:rFonts w:ascii="맑은 고딕" w:hAnsi="맑은 고딕"/>
+          <w:b/>
+          <w:color w:val="6366F1"/>
+          <w:sz w:val="20"/>
+        </w:rPr>
+        <w:t xml:space="preserve">⁃ </w:t>
+      </w:r>
+      <w:r>
+        <w:rPr>
+          <w:rFonts w:ascii="맑은 고딕" w:hAnsi="맑은 고딕" w:eastAsia="맑은 고딕"/>
+          <w:color w:val="334155"/>
+          <w:sz w:val="20"/>
+        </w:rPr>
+        <w:t xml:space="preserve">전체 모수가 4개에서 5개로 늘어나며 진행률이 </w:t>
       </w:r>
       <w:r>
         <w:rPr>
@@ -5280,21 +5459,36 @@
           <w:color w:val="B42846"/>
           <w:sz w:val="19"/>
         </w:rPr>
-        <w:t>책상 위 물 한 컵 ✨ · 언제든 1분이라도</w:t>
-      </w:r>
-      <w:r>
-        <w:rPr>
-          <w:rFonts w:ascii="맑은 고딕" w:hAnsi="맑은 고딕" w:eastAsia="맑은 고딕"/>
-          <w:color w:val="334155"/>
-          <w:sz w:val="20"/>
-        </w:rPr>
-        <w:t>) 즉시 삽입.</w:t>
+        <w:t>5개 중 2½개 완료 (+새 습관 ✨)</w:t>
+      </w:r>
+      <w:r>
+        <w:rPr>
+          <w:rFonts w:ascii="맑은 고딕" w:hAnsi="맑은 고딕" w:eastAsia="맑은 고딕"/>
+          <w:color w:val="334155"/>
+          <w:sz w:val="20"/>
+        </w:rPr>
+        <w:t>로 재계산됨.</w:t>
       </w:r>
     </w:p>
     <w:p>
       <w:pPr>
+        <w:keepNext/>
+        <w:spacing w:before="160" w:after="60"/>
+      </w:pPr>
+      <w:r>
+        <w:rPr>
+          <w:rFonts w:ascii="맑은 고딕" w:hAnsi="맑은 고딕" w:eastAsia="맑은 고딕"/>
+          <w:b/>
+          <w:color w:val="334155"/>
+          <w:sz w:val="22"/>
+        </w:rPr>
+        <w:t>[시각적 메타포 및 스타일링 규격 (Circle Fill Progression)]</w:t>
+      </w:r>
+    </w:p>
+    <w:p>
+      <w:pPr>
         <w:spacing w:before="30" w:after="30"/>
-        <w:ind w:left="720"/>
+        <w:ind w:left="360"/>
       </w:pPr>
       <w:r>
         <w:rPr>
@@ -5303,15 +5497,24 @@
           <w:color w:val="6366F1"/>
           <w:sz w:val="20"/>
         </w:rPr>
-        <w:t xml:space="preserve">⁃ </w:t>
-      </w:r>
-      <w:r>
-        <w:rPr>
-          <w:rFonts w:ascii="맑은 고딕" w:hAnsi="맑은 고딕" w:eastAsia="맑은 고딕"/>
-          <w:color w:val="334155"/>
-          <w:sz w:val="20"/>
-        </w:rPr>
-        <w:t xml:space="preserve">전체 모수가 4개에서 5개로 늘어나며 진행률이 </w:t>
+        <w:t xml:space="preserve">• </w:t>
+      </w:r>
+      <w:r>
+        <w:rPr>
+          <w:rFonts w:ascii="맑은 고딕" w:hAnsi="맑은 고딕" w:eastAsia="맑은 고딕"/>
+          <w:b/>
+          <w:color w:val="334155"/>
+          <w:sz w:val="20"/>
+        </w:rPr>
+        <w:t>`○` 대기 (0% 시작 전)</w:t>
+      </w:r>
+      <w:r>
+        <w:rPr>
+          <w:rFonts w:ascii="맑은 고딕" w:hAnsi="맑은 고딕" w:eastAsia="맑은 고딕"/>
+          <w:color w:val="334155"/>
+          <w:sz w:val="20"/>
+        </w:rPr>
+        <w:t>: 테두리 옅은 회색(</w:t>
       </w:r>
       <w:r>
         <w:rPr>
@@ -5319,34 +5522,19 @@
           <w:color w:val="B42846"/>
           <w:sz w:val="19"/>
         </w:rPr>
-        <w:t>5개 중 2½개 완료 (+새 습관 ✨)</w:t>
-      </w:r>
-      <w:r>
-        <w:rPr>
-          <w:rFonts w:ascii="맑은 고딕" w:hAnsi="맑은 고딕" w:eastAsia="맑은 고딕"/>
-          <w:color w:val="334155"/>
-          <w:sz w:val="20"/>
-        </w:rPr>
-        <w:t>로 재계산됨.</w:t>
+        <w:t>Border: #CBD5E0</w:t>
+      </w:r>
+      <w:r>
+        <w:rPr>
+          <w:rFonts w:ascii="맑은 고딕" w:hAnsi="맑은 고딕" w:eastAsia="맑은 고딕"/>
+          <w:color w:val="334155"/>
+          <w:sz w:val="20"/>
+        </w:rPr>
+        <w:t>), 배경 투명/흰색. 아직 채우지 않은 빈 상태.</w:t>
       </w:r>
     </w:p>
     <w:p>
       <w:pPr>
-        <w:keepNext/>
-        <w:spacing w:before="160" w:after="60"/>
-      </w:pPr>
-      <w:r>
-        <w:rPr>
-          <w:rFonts w:ascii="맑은 고딕" w:hAnsi="맑은 고딕" w:eastAsia="맑은 고딕"/>
-          <w:b/>
-          <w:color w:val="334155"/>
-          <w:sz w:val="22"/>
-        </w:rPr>
-        <w:t>[시각적 메타포 및 스타일링 규격 (Circle Fill Progression)]</w:t>
-      </w:r>
-    </w:p>
-    <w:p>
-      <w:pPr>
         <w:spacing w:before="30" w:after="30"/>
         <w:ind w:left="360"/>
       </w:pPr>
@@ -5366,15 +5554,15 @@
           <w:color w:val="334155"/>
           <w:sz w:val="20"/>
         </w:rPr>
-        <w:t>`○` 대기 (0% 시작 전)</w:t>
-      </w:r>
-      <w:r>
-        <w:rPr>
-          <w:rFonts w:ascii="맑은 고딕" w:hAnsi="맑은 고딕" w:eastAsia="맑은 고딕"/>
-          <w:color w:val="334155"/>
-          <w:sz w:val="20"/>
-        </w:rPr>
-        <w:t>: 테두리 옅은 회색(</w:t>
+        <w:t>`◐` 조금 완료 (0.5점, 50% 절반 채움)</w:t>
+      </w:r>
+      <w:r>
+        <w:rPr>
+          <w:rFonts w:ascii="맑은 고딕" w:hAnsi="맑은 고딕" w:eastAsia="맑은 고딕"/>
+          <w:color w:val="334155"/>
+          <w:sz w:val="20"/>
+        </w:rPr>
+        <w:t>: 왼쪽 절반 채움(</w:t>
       </w:r>
       <w:r>
         <w:rPr>
@@ -5382,47 +5570,15 @@
           <w:color w:val="B42846"/>
           <w:sz w:val="19"/>
         </w:rPr>
-        <w:t>Border: #CBD5E0</w:t>
-      </w:r>
-      <w:r>
-        <w:rPr>
-          <w:rFonts w:ascii="맑은 고딕" w:hAnsi="맑은 고딕" w:eastAsia="맑은 고딕"/>
-          <w:color w:val="334155"/>
-          <w:sz w:val="20"/>
-        </w:rPr>
-        <w:t>), 배경 투명/흰색. 아직 채우지 않은 빈 컵 상태.</w:t>
-      </w:r>
-    </w:p>
-    <w:p>
-      <w:pPr>
-        <w:spacing w:before="30" w:after="30"/>
-        <w:ind w:left="360"/>
-      </w:pPr>
-      <w:r>
-        <w:rPr>
-          <w:rFonts w:ascii="맑은 고딕" w:hAnsi="맑은 고딕"/>
-          <w:b/>
-          <w:color w:val="6366F1"/>
-          <w:sz w:val="20"/>
-        </w:rPr>
-        <w:t xml:space="preserve">• </w:t>
-      </w:r>
-      <w:r>
-        <w:rPr>
-          <w:rFonts w:ascii="맑은 고딕" w:hAnsi="맑은 고딕" w:eastAsia="맑은 고딕"/>
-          <w:b/>
-          <w:color w:val="334155"/>
-          <w:sz w:val="20"/>
-        </w:rPr>
-        <w:t>`◐` 조금 완료 (0.5점, 50% 절반 채움)</w:t>
-      </w:r>
-      <w:r>
-        <w:rPr>
-          <w:rFonts w:ascii="맑은 고딕" w:hAnsi="맑은 고딕" w:eastAsia="맑은 고딕"/>
-          <w:color w:val="334155"/>
-          <w:sz w:val="20"/>
-        </w:rPr>
-        <w:t>: 왼쪽 절반 채움(</w:t>
+        <w:t>Fill: #7B61A8</w:t>
+      </w:r>
+      <w:r>
+        <w:rPr>
+          <w:rFonts w:ascii="맑은 고딕" w:hAnsi="맑은 고딕" w:eastAsia="맑은 고딕"/>
+          <w:color w:val="334155"/>
+          <w:sz w:val="20"/>
+        </w:rPr>
+        <w:t xml:space="preserve"> 또는 </w:t>
       </w:r>
       <w:r>
         <w:rPr>
@@ -5430,15 +5586,15 @@
           <w:color w:val="B42846"/>
           <w:sz w:val="19"/>
         </w:rPr>
-        <w:t>Fill: #7B61A8</w:t>
-      </w:r>
-      <w:r>
-        <w:rPr>
-          <w:rFonts w:ascii="맑은 고딕" w:hAnsi="맑은 고딕" w:eastAsia="맑은 고딕"/>
-          <w:color w:val="334155"/>
-          <w:sz w:val="20"/>
-        </w:rPr>
-        <w:t xml:space="preserve"> 또는 </w:t>
+        <w:t>#F59E0B</w:t>
+      </w:r>
+      <w:r>
+        <w:rPr>
+          <w:rFonts w:ascii="맑은 고딕" w:hAnsi="맑은 고딕" w:eastAsia="맑은 고딕"/>
+          <w:color w:val="334155"/>
+          <w:sz w:val="20"/>
+        </w:rPr>
+        <w:t xml:space="preserve">). 미완료 느낌의 </w:t>
       </w:r>
       <w:r>
         <w:rPr>
@@ -5446,15 +5602,47 @@
           <w:color w:val="B42846"/>
           <w:sz w:val="19"/>
         </w:rPr>
-        <w:t>#F59E0B</w:t>
-      </w:r>
-      <w:r>
-        <w:rPr>
-          <w:rFonts w:ascii="맑은 고딕" w:hAnsi="맑은 고딕" w:eastAsia="맑은 고딕"/>
-          <w:color w:val="334155"/>
-          <w:sz w:val="20"/>
-        </w:rPr>
-        <w:t xml:space="preserve">). 미완료 느낌의 </w:t>
+        <w:t>—</w:t>
+      </w:r>
+      <w:r>
+        <w:rPr>
+          <w:rFonts w:ascii="맑은 고딕" w:hAnsi="맑은 고딕" w:eastAsia="맑은 고딕"/>
+          <w:color w:val="334155"/>
+          <w:sz w:val="20"/>
+        </w:rPr>
+        <w:t xml:space="preserve"> 대신 "절반이라도 채웠다"는 긍정적 진행도를 직관적으로 전달함.</w:t>
+      </w:r>
+    </w:p>
+    <w:p>
+      <w:pPr>
+        <w:spacing w:before="30" w:after="30"/>
+        <w:ind w:left="360"/>
+      </w:pPr>
+      <w:r>
+        <w:rPr>
+          <w:rFonts w:ascii="맑은 고딕" w:hAnsi="맑은 고딕"/>
+          <w:b/>
+          <w:color w:val="6366F1"/>
+          <w:sz w:val="20"/>
+        </w:rPr>
+        <w:t xml:space="preserve">• </w:t>
+      </w:r>
+      <w:r>
+        <w:rPr>
+          <w:rFonts w:ascii="맑은 고딕" w:hAnsi="맑은 고딕" w:eastAsia="맑은 고딕"/>
+          <w:b/>
+          <w:color w:val="334155"/>
+          <w:sz w:val="20"/>
+        </w:rPr>
+        <w:t>`●` 완료 (1.0점 만점, 100% 꽉 채움)</w:t>
+      </w:r>
+      <w:r>
+        <w:rPr>
+          <w:rFonts w:ascii="맑은 고딕" w:hAnsi="맑은 고딕" w:eastAsia="맑은 고딕"/>
+          <w:color w:val="334155"/>
+          <w:sz w:val="20"/>
+        </w:rPr>
+        <w:t>: 싱그러운 녹색 가득 채움(</w:t>
       </w:r>
       <w:r>
         <w:rPr>
@@ -5462,15 +5650,15 @@
           <w:color w:val="B42846"/>
           <w:sz w:val="19"/>
         </w:rPr>
-        <w:t>—</w:t>
-      </w:r>
-      <w:r>
-        <w:rPr>
-          <w:rFonts w:ascii="맑은 고딕" w:hAnsi="맑은 고딕" w:eastAsia="맑은 고딕"/>
-          <w:color w:val="334155"/>
-          <w:sz w:val="20"/>
-        </w:rPr>
-        <w:t xml:space="preserve"> 대신 "절반이라도 채웠다"는 진행도를 직관적으로 전달함.</w:t>
+        <w:t>Fill: #34A853</w:t>
+      </w:r>
+      <w:r>
+        <w:rPr>
+          <w:rFonts w:ascii="맑은 고딕" w:hAnsi="맑은 고딕" w:eastAsia="맑은 고딕"/>
+          <w:color w:val="334155"/>
+          <w:sz w:val="20"/>
+        </w:rPr>
+        <w:t>). 목표를 완벽하게 달성함.</w:t>
       </w:r>
     </w:p>
     <w:p>
@@ -5490,19 +5678,335 @@
       <w:r>
         <w:rPr>
           <w:rFonts w:ascii="맑은 고딕" w:hAnsi="맑은 고딕" w:eastAsia="맑은 고딕"/>
-          <w:b/>
-          <w:color w:val="334155"/>
-          <w:sz w:val="20"/>
-        </w:rPr>
-        <w:t>`●` 완료 (1.0점 만점, 100% 꽉 채움)</w:t>
-      </w:r>
-      <w:r>
-        <w:rPr>
-          <w:rFonts w:ascii="맑은 고딕" w:hAnsi="맑은 고딕" w:eastAsia="맑은 고딕"/>
-          <w:color w:val="334155"/>
-          <w:sz w:val="20"/>
-        </w:rPr>
-        <w:t>: 싱그러운 녹색 가득 채움(</w:t>
+          <w:i/>
+          <w:color w:val="334155"/>
+          <w:sz w:val="20"/>
+        </w:rPr>
+        <w:t>'오늘 쉬기' 항목은 불필요한 선택지 복잡도를 줄이기 위해 배제하며, 미실천 항목은 기본 0점(대기)으로 유지함.</w:t>
+      </w:r>
+    </w:p>
+    <w:p>
+      <w:pPr>
+        <w:keepNext/>
+        <w:spacing w:before="160" w:after="60"/>
+      </w:pPr>
+      <w:r>
+        <w:rPr>
+          <w:rFonts w:ascii="맑은 고딕" w:hAnsi="맑은 고딕" w:eastAsia="맑은 고딕"/>
+          <w:b/>
+          <w:color w:val="334155"/>
+          <w:sz w:val="22"/>
+        </w:rPr>
+        <w:t>[모달 2종 세부 동작 및 입력 스펙]</w:t>
+      </w:r>
+    </w:p>
+    <w:p>
+      <w:pPr>
+        <w:spacing w:before="30" w:after="30"/>
+        <w:ind w:left="360"/>
+      </w:pPr>
+      <w:r>
+        <w:rPr>
+          <w:rFonts w:ascii="맑은 고딕" w:hAnsi="맑은 고딕"/>
+          <w:b/>
+          <w:color w:val="2563EB"/>
+          <w:sz w:val="20"/>
+        </w:rPr>
+        <w:t xml:space="preserve">1. </w:t>
+      </w:r>
+      <w:r>
+        <w:rPr>
+          <w:rFonts w:ascii="맑은 고딕" w:hAnsi="맑은 고딕" w:eastAsia="맑은 고딕"/>
+          <w:b/>
+          <w:color w:val="334155"/>
+          <w:sz w:val="20"/>
+        </w:rPr>
+        <w:t>`습관 상태 선택` 모달 ("오늘은 어떻게 했나요?")</w:t>
+      </w:r>
+    </w:p>
+    <w:p>
+      <w:pPr>
+        <w:spacing w:before="30" w:after="30"/>
+        <w:ind w:left="720"/>
+      </w:pPr>
+      <w:r>
+        <w:rPr>
+          <w:rFonts w:ascii="맑은 고딕" w:hAnsi="맑은 고딕"/>
+          <w:b/>
+          <w:color w:val="6366F1"/>
+          <w:sz w:val="20"/>
+        </w:rPr>
+        <w:t xml:space="preserve">⁃ </w:t>
+      </w:r>
+      <w:r>
+        <w:rPr>
+          <w:rFonts w:ascii="맑은 고딕" w:hAnsi="맑은 고딕" w:eastAsia="맑은 고딕"/>
+          <w:color w:val="334155"/>
+          <w:sz w:val="20"/>
+        </w:rPr>
+        <w:t>상단 요약 정보: 선택된 습관명, 목표 빈도, 누적 출석일수.</w:t>
+      </w:r>
+    </w:p>
+    <w:p>
+      <w:pPr>
+        <w:spacing w:before="30" w:after="30"/>
+        <w:ind w:left="720"/>
+      </w:pPr>
+      <w:r>
+        <w:rPr>
+          <w:rFonts w:ascii="맑은 고딕" w:hAnsi="맑은 고딕"/>
+          <w:b/>
+          <w:color w:val="6366F1"/>
+          <w:sz w:val="20"/>
+        </w:rPr>
+        <w:t xml:space="preserve">⁃ </w:t>
+      </w:r>
+      <w:r>
+        <w:rPr>
+          <w:rFonts w:ascii="맑은 고딕" w:hAnsi="맑은 고딕" w:eastAsia="맑은 고딕"/>
+          <w:b/>
+          <w:color w:val="334155"/>
+          <w:sz w:val="20"/>
+        </w:rPr>
+        <w:t>2대 상태 선택 칩</w:t>
+      </w:r>
+      <w:r>
+        <w:rPr>
+          <w:rFonts w:ascii="맑은 고딕" w:hAnsi="맑은 고딕" w:eastAsia="맑은 고딕"/>
+          <w:color w:val="334155"/>
+          <w:sz w:val="20"/>
+        </w:rPr>
+        <w:t>:</w:t>
+      </w:r>
+    </w:p>
+    <w:p>
+      <w:pPr>
+        <w:spacing w:before="30" w:after="30"/>
+        <w:ind w:left="1080"/>
+      </w:pPr>
+      <w:r>
+        <w:rPr>
+          <w:rFonts w:ascii="맑은 고딕" w:hAnsi="맑은 고딕"/>
+          <w:b/>
+          <w:color w:val="6366F1"/>
+          <w:sz w:val="20"/>
+        </w:rPr>
+        <w:t xml:space="preserve">⁃ </w:t>
+      </w:r>
+      <w:r>
+        <w:rPr>
+          <w:rFonts w:ascii="Consolas" w:hAnsi="Consolas" w:eastAsia="맑은 고딕"/>
+          <w:b/>
+          <w:color w:val="A0283C"/>
+          <w:sz w:val="19"/>
+        </w:rPr>
+        <w:t>[● 완료]</w:t>
+      </w:r>
+      <w:r>
+        <w:rPr>
+          <w:rFonts w:ascii="맑은 고딕" w:hAnsi="맑은 고딕" w:eastAsia="맑은 고딕"/>
+          <w:color w:val="334155"/>
+          <w:sz w:val="20"/>
+        </w:rPr>
+        <w:t xml:space="preserve"> (1.0점, 녹색): </w:t>
+      </w:r>
+      <w:r>
+        <w:rPr>
+          <w:rFonts w:ascii="맑은 고딕" w:hAnsi="맑은 고딕" w:eastAsia="맑은 고딕"/>
+          <w:i/>
+          <w:color w:val="334155"/>
+          <w:sz w:val="20"/>
+        </w:rPr>
+        <w:t>"완벽해요! 습관을 끝마쳤어요."</w:t>
+      </w:r>
+    </w:p>
+    <w:p>
+      <w:pPr>
+        <w:spacing w:before="30" w:after="30"/>
+        <w:ind w:left="1080"/>
+      </w:pPr>
+      <w:r>
+        <w:rPr>
+          <w:rFonts w:ascii="맑은 고딕" w:hAnsi="맑은 고딕"/>
+          <w:b/>
+          <w:color w:val="6366F1"/>
+          <w:sz w:val="20"/>
+        </w:rPr>
+        <w:t xml:space="preserve">⁃ </w:t>
+      </w:r>
+      <w:r>
+        <w:rPr>
+          <w:rFonts w:ascii="Consolas" w:hAnsi="Consolas" w:eastAsia="맑은 고딕"/>
+          <w:b/>
+          <w:color w:val="A0283C"/>
+          <w:sz w:val="19"/>
+        </w:rPr>
+        <w:t>[◐ 조금 완료]</w:t>
+      </w:r>
+      <w:r>
+        <w:rPr>
+          <w:rFonts w:ascii="맑은 고딕" w:hAnsi="맑은 고딕" w:eastAsia="맑은 고딕"/>
+          <w:color w:val="334155"/>
+          <w:sz w:val="20"/>
+        </w:rPr>
+        <w:t xml:space="preserve"> (0.5점, 연보라/주황): </w:t>
+      </w:r>
+      <w:r>
+        <w:rPr>
+          <w:rFonts w:ascii="맑은 고딕" w:hAnsi="맑은 고딕" w:eastAsia="맑은 고딕"/>
+          <w:i/>
+          <w:color w:val="334155"/>
+          <w:sz w:val="20"/>
+        </w:rPr>
+        <w:t>"절반이라도 채운 게 어디예요! 훌륭해요."</w:t>
+      </w:r>
+    </w:p>
+    <w:p>
+      <w:pPr>
+        <w:spacing w:before="30" w:after="30"/>
+        <w:ind w:left="720"/>
+      </w:pPr>
+      <w:r>
+        <w:rPr>
+          <w:rFonts w:ascii="맑은 고딕" w:hAnsi="맑은 고딕"/>
+          <w:b/>
+          <w:color w:val="6366F1"/>
+          <w:sz w:val="20"/>
+        </w:rPr>
+        <w:t xml:space="preserve">⁃ </w:t>
+      </w:r>
+      <w:r>
+        <w:rPr>
+          <w:rFonts w:ascii="맑은 고딕" w:hAnsi="맑은 고딕" w:eastAsia="맑은 고딕"/>
+          <w:color w:val="334155"/>
+          <w:sz w:val="20"/>
+        </w:rPr>
+        <w:t>모달 닫기 규칙: 바깥 배경 터치 또는 [취소] 클릭 시에만 닫힘. [상태 기록] 버튼 클릭 시 상태 2로 화면 전환.</w:t>
+      </w:r>
+    </w:p>
+    <w:p>
+      <w:pPr>
+        <w:spacing w:before="30" w:after="30"/>
+        <w:ind w:left="360"/>
+      </w:pPr>
+      <w:r>
+        <w:rPr>
+          <w:rFonts w:ascii="맑은 고딕" w:hAnsi="맑은 고딕"/>
+          <w:b/>
+          <w:color w:val="2563EB"/>
+          <w:sz w:val="20"/>
+        </w:rPr>
+        <w:t xml:space="preserve">2. </w:t>
+      </w:r>
+      <w:r>
+        <w:rPr>
+          <w:rFonts w:ascii="맑은 고딕" w:hAnsi="맑은 고딕" w:eastAsia="맑은 고딕"/>
+          <w:b/>
+          <w:color w:val="334155"/>
+          <w:sz w:val="20"/>
+        </w:rPr>
+        <w:t>`작은 습관 추가` 모달</w:t>
+      </w:r>
+    </w:p>
+    <w:p>
+      <w:pPr>
+        <w:spacing w:before="30" w:after="30"/>
+        <w:ind w:left="720"/>
+      </w:pPr>
+      <w:r>
+        <w:rPr>
+          <w:rFonts w:ascii="맑은 고딕" w:hAnsi="맑은 고딕"/>
+          <w:b/>
+          <w:color w:val="6366F1"/>
+          <w:sz w:val="20"/>
+        </w:rPr>
+        <w:t xml:space="preserve">⁃ </w:t>
+      </w:r>
+      <w:r>
+        <w:rPr>
+          <w:rFonts w:ascii="맑은 고딕" w:hAnsi="맑은 고딕" w:eastAsia="맑은 고딕"/>
+          <w:b/>
+          <w:color w:val="334155"/>
+          <w:sz w:val="20"/>
+        </w:rPr>
+        <w:t>입력 필드 스펙</w:t>
+      </w:r>
+      <w:r>
+        <w:rPr>
+          <w:rFonts w:ascii="맑은 고딕" w:hAnsi="맑은 고딕" w:eastAsia="맑은 고딕"/>
+          <w:color w:val="334155"/>
+          <w:sz w:val="20"/>
+        </w:rPr>
+        <w:t>:</w:t>
+      </w:r>
+    </w:p>
+    <w:p>
+      <w:pPr>
+        <w:spacing w:before="30" w:after="30"/>
+        <w:ind w:left="1080"/>
+      </w:pPr>
+      <w:r>
+        <w:rPr>
+          <w:rFonts w:ascii="맑은 고딕" w:hAnsi="맑은 고딕"/>
+          <w:b/>
+          <w:color w:val="6366F1"/>
+          <w:sz w:val="20"/>
+        </w:rPr>
+        <w:t xml:space="preserve">⁃ </w:t>
+      </w:r>
+      <w:r>
+        <w:rPr>
+          <w:rFonts w:ascii="맑은 고딕" w:hAnsi="맑은 고딕" w:eastAsia="맑은 고딕"/>
+          <w:color w:val="334155"/>
+          <w:sz w:val="20"/>
+        </w:rPr>
+        <w:t>습관명 입력창 (예: 책상 위 물 한 컵)</w:t>
+      </w:r>
+    </w:p>
+    <w:p>
+      <w:pPr>
+        <w:spacing w:before="30" w:after="30"/>
+        <w:ind w:left="1080"/>
+      </w:pPr>
+      <w:r>
+        <w:rPr>
+          <w:rFonts w:ascii="맑은 고딕" w:hAnsi="맑은 고딕"/>
+          <w:b/>
+          <w:color w:val="6366F1"/>
+          <w:sz w:val="20"/>
+        </w:rPr>
+        <w:t xml:space="preserve">⁃ </w:t>
+      </w:r>
+      <w:r>
+        <w:rPr>
+          <w:rFonts w:ascii="맑은 고딕" w:hAnsi="맑은 고딕" w:eastAsia="맑은 고딕"/>
+          <w:color w:val="334155"/>
+          <w:sz w:val="20"/>
+        </w:rPr>
+        <w:t>실천 가이드 텍스트 (예: 언제든 · 1분이라도)</w:t>
+      </w:r>
+    </w:p>
+    <w:p>
+      <w:pPr>
+        <w:spacing w:before="30" w:after="30"/>
+        <w:ind w:left="1080"/>
+      </w:pPr>
+      <w:r>
+        <w:rPr>
+          <w:rFonts w:ascii="맑은 고딕" w:hAnsi="맑은 고딕"/>
+          <w:b/>
+          <w:color w:val="6366F1"/>
+          <w:sz w:val="20"/>
+        </w:rPr>
+        <w:t xml:space="preserve">⁃ </w:t>
+      </w:r>
+      <w:r>
+        <w:rPr>
+          <w:rFonts w:ascii="맑은 고딕" w:hAnsi="맑은 고딕" w:eastAsia="맑은 고딕"/>
+          <w:color w:val="334155"/>
+          <w:sz w:val="20"/>
+        </w:rPr>
+        <w:t xml:space="preserve">목표 빈도 라디오: </w:t>
       </w:r>
       <w:r>
         <w:rPr>
@@ -5510,47 +6014,15 @@
           <w:color w:val="B42846"/>
           <w:sz w:val="19"/>
         </w:rPr>
-        <w:t>Fill: #34A853</w:t>
-      </w:r>
-      <w:r>
-        <w:rPr>
-          <w:rFonts w:ascii="맑은 고딕" w:hAnsi="맑은 고딕" w:eastAsia="맑은 고딕"/>
-          <w:color w:val="334155"/>
-          <w:sz w:val="20"/>
-        </w:rPr>
-        <w:t>). 목표를 빈틈없이 완벽하게 달성함.</w:t>
-      </w:r>
-    </w:p>
-    <w:p>
-      <w:pPr>
-        <w:spacing w:before="30" w:after="30"/>
-        <w:ind w:left="360"/>
-      </w:pPr>
-      <w:r>
-        <w:rPr>
-          <w:rFonts w:ascii="맑은 고딕" w:hAnsi="맑은 고딕"/>
-          <w:b/>
-          <w:color w:val="6366F1"/>
-          <w:sz w:val="20"/>
-        </w:rPr>
-        <w:t xml:space="preserve">• </w:t>
-      </w:r>
-      <w:r>
-        <w:rPr>
-          <w:rFonts w:ascii="맑은 고딕" w:hAnsi="맑은 고딕" w:eastAsia="맑은 고딕"/>
-          <w:b/>
-          <w:color w:val="334155"/>
-          <w:sz w:val="20"/>
-        </w:rPr>
-        <w:t>`⏸` 오늘 쉬기 (0.0점, 일시정지)</w:t>
-      </w:r>
-      <w:r>
-        <w:rPr>
-          <w:rFonts w:ascii="맑은 고딕" w:hAnsi="맑은 고딕" w:eastAsia="맑은 고딕"/>
-          <w:color w:val="334155"/>
-          <w:sz w:val="20"/>
-        </w:rPr>
-        <w:t>: 차분한 하늘/연회색 캡슐 배지(</w:t>
+        <w:t>[매일]</w:t>
+      </w:r>
+      <w:r>
+        <w:rPr>
+          <w:rFonts w:ascii="맑은 고딕" w:hAnsi="맑은 고딕" w:eastAsia="맑은 고딕"/>
+          <w:color w:val="334155"/>
+          <w:sz w:val="20"/>
+        </w:rPr>
+        <w:t xml:space="preserve"> / </w:t>
       </w:r>
       <w:r>
         <w:rPr>
@@ -5558,15 +6030,15 @@
           <w:color w:val="B42846"/>
           <w:sz w:val="19"/>
         </w:rPr>
-        <w:t>Fill: #F1F5F9</w:t>
-      </w:r>
-      <w:r>
-        <w:rPr>
-          <w:rFonts w:ascii="맑은 고딕" w:hAnsi="맑은 고딕" w:eastAsia="맑은 고딕"/>
-          <w:color w:val="334155"/>
-          <w:sz w:val="20"/>
-        </w:rPr>
-        <w:t xml:space="preserve">, </w:t>
+        <w:t>[주간 자유 빈도 (주 N회)]</w:t>
+      </w:r>
+      <w:r>
+        <w:rPr>
+          <w:rFonts w:ascii="맑은 고딕" w:hAnsi="맑은 고딕" w:eastAsia="맑은 고딕"/>
+          <w:color w:val="334155"/>
+          <w:sz w:val="20"/>
+        </w:rPr>
+        <w:t xml:space="preserve"> / </w:t>
       </w:r>
       <w:r>
         <w:rPr>
@@ -5574,19 +6046,57 @@
           <w:color w:val="B42846"/>
           <w:sz w:val="19"/>
         </w:rPr>
-        <w:t>Icon: #64748B</w:t>
-      </w:r>
-      <w:r>
-        <w:rPr>
-          <w:rFonts w:ascii="맑은 고딕" w:hAnsi="맑은 고딕" w:eastAsia="맑은 고딕"/>
-          <w:color w:val="334155"/>
-          <w:sz w:val="20"/>
-        </w:rPr>
-        <w:t>). 원을 덜 채운 결핍감이 아니라 미디어 플레이어의 일시정지처럼 "잠깐 멈추고 쉬어가는 것(Pause)"으로 분리하여 회복 출석 인정.</w:t>
+        <w:t>[특정 요일 선택]</w:t>
       </w:r>
     </w:p>
     <w:p>
       <w:pPr>
+        <w:spacing w:before="30" w:after="30"/>
+        <w:ind w:left="1080"/>
+      </w:pPr>
+      <w:r>
+        <w:rPr>
+          <w:rFonts w:ascii="맑은 고딕" w:hAnsi="맑은 고딕"/>
+          <w:b/>
+          <w:color w:val="6366F1"/>
+          <w:sz w:val="20"/>
+        </w:rPr>
+        <w:t xml:space="preserve">⁃ </w:t>
+      </w:r>
+      <w:r>
+        <w:rPr>
+          <w:rFonts w:ascii="맑은 고딕" w:hAnsi="맑은 고딕" w:eastAsia="맑은 고딕"/>
+          <w:color w:val="334155"/>
+          <w:sz w:val="20"/>
+        </w:rPr>
+        <w:t>리마인드 알림 시간대 설정</w:t>
+      </w:r>
+    </w:p>
+    <w:p>
+      <w:pPr>
+        <w:spacing w:before="30" w:after="30"/>
+        <w:ind w:left="720"/>
+      </w:pPr>
+      <w:r>
+        <w:rPr>
+          <w:rFonts w:ascii="맑은 고딕" w:hAnsi="맑은 고딕"/>
+          <w:b/>
+          <w:color w:val="6366F1"/>
+          <w:sz w:val="20"/>
+        </w:rPr>
+        <w:t xml:space="preserve">⁃ </w:t>
+      </w:r>
+      <w:r>
+        <w:rPr>
+          <w:rFonts w:ascii="맑은 고딕" w:hAnsi="맑은 고딕" w:eastAsia="맑은 고딕"/>
+          <w:color w:val="334155"/>
+          <w:sz w:val="20"/>
+        </w:rPr>
+        <w:t>[저장] 버튼 클릭 시 목록 최상단에 새 습관 생성.</w:t>
+      </w:r>
+    </w:p>
+    <w:p>
+      <w:pPr>
         <w:keepNext/>
         <w:spacing w:before="160" w:after="60"/>
       </w:pPr>
@@ -5597,7 +6107,7 @@
           <w:color w:val="334155"/>
           <w:sz w:val="22"/>
         </w:rPr>
-        <w:t>[모달 2종 세부 동작 및 입력 스펙]</w:t>
+        <w:t>[비즈니스 로직 &amp; 달성률 계산 공식]</w:t>
       </w:r>
     </w:p>
     <w:p>
@@ -5609,48 +6119,46 @@
         <w:rPr>
           <w:rFonts w:ascii="맑은 고딕" w:hAnsi="맑은 고딕"/>
           <w:b/>
-          <w:color w:val="2563EB"/>
-          <w:sz w:val="20"/>
-        </w:rPr>
-        <w:t xml:space="preserve">1. </w:t>
-      </w:r>
-      <w:r>
-        <w:rPr>
-          <w:rFonts w:ascii="맑은 고딕" w:hAnsi="맑은 고딕" w:eastAsia="맑은 고딕"/>
-          <w:b/>
-          <w:color w:val="334155"/>
-          <w:sz w:val="20"/>
-        </w:rPr>
-        <w:t>`습관 상태 선택` 모달 ("오늘은 어떻게 했나요?")</w:t>
+          <w:color w:val="6366F1"/>
+          <w:sz w:val="20"/>
+        </w:rPr>
+        <w:t xml:space="preserve">• </w:t>
+      </w:r>
+      <w:r>
+        <w:rPr>
+          <w:rFonts w:ascii="맑은 고딕" w:hAnsi="맑은 고딕" w:eastAsia="맑은 고딕"/>
+          <w:b/>
+          <w:color w:val="334155"/>
+          <w:sz w:val="20"/>
+        </w:rPr>
+        <w:t>일일 습관 달성률 계산 공식</w:t>
+      </w:r>
+      <w:r>
+        <w:rPr>
+          <w:rFonts w:ascii="맑은 고딕" w:hAnsi="맑은 고딕" w:eastAsia="맑은 고딕"/>
+          <w:color w:val="334155"/>
+          <w:sz w:val="20"/>
+        </w:rPr>
+        <w:t>:</w:t>
       </w:r>
     </w:p>
     <w:p>
       <w:pPr>
-        <w:spacing w:before="30" w:after="30"/>
-        <w:ind w:left="720"/>
-      </w:pPr>
-      <w:r>
-        <w:rPr>
-          <w:rFonts w:ascii="맑은 고딕" w:hAnsi="맑은 고딕"/>
-          <w:b/>
-          <w:color w:val="6366F1"/>
-          <w:sz w:val="20"/>
-        </w:rPr>
-        <w:t xml:space="preserve">⁃ </w:t>
-      </w:r>
-      <w:r>
-        <w:rPr>
-          <w:rFonts w:ascii="맑은 고딕" w:hAnsi="맑은 고딕" w:eastAsia="맑은 고딕"/>
-          <w:color w:val="334155"/>
-          <w:sz w:val="20"/>
-        </w:rPr>
-        <w:t>상단 요약 정보: 선택된 습관명, 목표 빈도, 누적 출석일수.</w:t>
+        <w:spacing w:before="50" w:after="70" w:line="300" w:lineRule="auto"/>
+      </w:pPr>
+      <w:r>
+        <w:rPr>
+          <w:rFonts w:ascii="맑은 고딕" w:hAnsi="맑은 고딕" w:eastAsia="맑은 고딕"/>
+          <w:color w:val="334155"/>
+          <w:sz w:val="21"/>
+        </w:rPr>
+        <w:t>$$\text{일일 습관 달성률}(\%) = \frac{\sum (\text{완료 수} \times 1.0 + \text{조금 완료 수} \times 0.5)}{\text{전체 등록 습관 수}} \times 100$$</w:t>
       </w:r>
     </w:p>
     <w:p>
       <w:pPr>
         <w:spacing w:before="30" w:after="30"/>
-        <w:ind w:left="720"/>
+        <w:ind w:left="360"/>
       </w:pPr>
       <w:r>
         <w:rPr>
@@ -5659,30 +6167,30 @@
           <w:color w:val="6366F1"/>
           <w:sz w:val="20"/>
         </w:rPr>
-        <w:t xml:space="preserve">⁃ </w:t>
-      </w:r>
-      <w:r>
-        <w:rPr>
-          <w:rFonts w:ascii="맑은 고딕" w:hAnsi="맑은 고딕" w:eastAsia="맑은 고딕"/>
-          <w:b/>
-          <w:color w:val="334155"/>
-          <w:sz w:val="20"/>
-        </w:rPr>
-        <w:t>3대 상태 선택 칩</w:t>
-      </w:r>
-      <w:r>
-        <w:rPr>
-          <w:rFonts w:ascii="맑은 고딕" w:hAnsi="맑은 고딕" w:eastAsia="맑은 고딕"/>
-          <w:color w:val="334155"/>
-          <w:sz w:val="20"/>
-        </w:rPr>
-        <w:t>:</w:t>
+        <w:t xml:space="preserve">• </w:t>
+      </w:r>
+      <w:r>
+        <w:rPr>
+          <w:rFonts w:ascii="맑은 고딕" w:hAnsi="맑은 고딕" w:eastAsia="맑은 고딕"/>
+          <w:b/>
+          <w:color w:val="334155"/>
+          <w:sz w:val="20"/>
+        </w:rPr>
+        <w:t>주간 자유 빈도형 습관 계산</w:t>
+      </w:r>
+      <w:r>
+        <w:rPr>
+          <w:rFonts w:ascii="맑은 고딕" w:hAnsi="맑은 고딕" w:eastAsia="맑은 고딕"/>
+          <w:color w:val="334155"/>
+          <w:sz w:val="20"/>
+        </w:rPr>
+        <w:t>: "주 3회 실천" 습관의 경우, 월~일 중 실천한 날짜 횟수가 3회에 도달하면 해당 주차 목표 완료로 판정.</w:t>
       </w:r>
     </w:p>
     <w:p>
       <w:pPr>
         <w:spacing w:before="30" w:after="30"/>
-        <w:ind w:left="1080"/>
+        <w:ind w:left="360"/>
       </w:pPr>
       <w:r>
         <w:rPr>
@@ -5691,263 +6199,24 @@
           <w:color w:val="6366F1"/>
           <w:sz w:val="20"/>
         </w:rPr>
-        <w:t xml:space="preserve">⁃ </w:t>
-      </w:r>
-      <w:r>
-        <w:rPr>
-          <w:rFonts w:ascii="Consolas" w:hAnsi="Consolas" w:eastAsia="맑은 고딕"/>
-          <w:b/>
-          <w:color w:val="A0283C"/>
-          <w:sz w:val="19"/>
-        </w:rPr>
-        <w:t>[● 완료]</w:t>
-      </w:r>
-      <w:r>
-        <w:rPr>
-          <w:rFonts w:ascii="맑은 고딕" w:hAnsi="맑은 고딕" w:eastAsia="맑은 고딕"/>
-          <w:color w:val="334155"/>
-          <w:sz w:val="20"/>
-        </w:rPr>
-        <w:t xml:space="preserve"> (1.0점, 녹색): </w:t>
-      </w:r>
-      <w:r>
-        <w:rPr>
-          <w:rFonts w:ascii="맑은 고딕" w:hAnsi="맑은 고딕" w:eastAsia="맑은 고딕"/>
-          <w:i/>
-          <w:color w:val="334155"/>
-          <w:sz w:val="20"/>
-        </w:rPr>
-        <w:t>"완벽해요! 습관을 끝마쳤어요."</w:t>
-      </w:r>
-    </w:p>
-    <w:p>
-      <w:pPr>
-        <w:spacing w:before="30" w:after="30"/>
-        <w:ind w:left="1080"/>
-      </w:pPr>
-      <w:r>
-        <w:rPr>
-          <w:rFonts w:ascii="맑은 고딕" w:hAnsi="맑은 고딕"/>
-          <w:b/>
-          <w:color w:val="6366F1"/>
-          <w:sz w:val="20"/>
-        </w:rPr>
-        <w:t xml:space="preserve">⁃ </w:t>
-      </w:r>
-      <w:r>
-        <w:rPr>
-          <w:rFonts w:ascii="Consolas" w:hAnsi="Consolas" w:eastAsia="맑은 고딕"/>
-          <w:b/>
-          <w:color w:val="A0283C"/>
-          <w:sz w:val="19"/>
-        </w:rPr>
-        <w:t>[◐ 조금 완료]</w:t>
-      </w:r>
-      <w:r>
-        <w:rPr>
-          <w:rFonts w:ascii="맑은 고딕" w:hAnsi="맑은 고딕" w:eastAsia="맑은 고딕"/>
-          <w:color w:val="334155"/>
-          <w:sz w:val="20"/>
-        </w:rPr>
-        <w:t xml:space="preserve"> (0.5점, 연보라/주황): </w:t>
-      </w:r>
-      <w:r>
-        <w:rPr>
-          <w:rFonts w:ascii="맑은 고딕" w:hAnsi="맑은 고딕" w:eastAsia="맑은 고딕"/>
-          <w:i/>
-          <w:color w:val="334155"/>
-          <w:sz w:val="20"/>
-        </w:rPr>
-        <w:t>"절반이라도 채운 게 어디예요! 훌륭해요."</w:t>
-      </w:r>
-    </w:p>
-    <w:p>
-      <w:pPr>
-        <w:spacing w:before="30" w:after="30"/>
-        <w:ind w:left="1080"/>
-      </w:pPr>
-      <w:r>
-        <w:rPr>
-          <w:rFonts w:ascii="맑은 고딕" w:hAnsi="맑은 고딕"/>
-          <w:b/>
-          <w:color w:val="6366F1"/>
-          <w:sz w:val="20"/>
-        </w:rPr>
-        <w:t xml:space="preserve">⁃ </w:t>
-      </w:r>
-      <w:r>
-        <w:rPr>
-          <w:rFonts w:ascii="Consolas" w:hAnsi="Consolas" w:eastAsia="맑은 고딕"/>
-          <w:b/>
-          <w:color w:val="A0283C"/>
-          <w:sz w:val="19"/>
-        </w:rPr>
-        <w:t>[⏸ 오늘 쉬기]</w:t>
-      </w:r>
-      <w:r>
-        <w:rPr>
-          <w:rFonts w:ascii="맑은 고딕" w:hAnsi="맑은 고딕" w:eastAsia="맑은 고딕"/>
-          <w:color w:val="334155"/>
-          <w:sz w:val="20"/>
-        </w:rPr>
-        <w:t xml:space="preserve"> (0.0점, 하늘색/회색): </w:t>
-      </w:r>
-      <w:r>
-        <w:rPr>
-          <w:rFonts w:ascii="맑은 고딕" w:hAnsi="맑은 고딕" w:eastAsia="맑은 고딕"/>
-          <w:i/>
-          <w:color w:val="334155"/>
-          <w:sz w:val="20"/>
-        </w:rPr>
-        <w:t>"잠깐 멈추고 쉬어가는 것도 회복의 중요한 일부예요."</w:t>
-      </w:r>
-    </w:p>
-    <w:p>
-      <w:pPr>
-        <w:spacing w:before="30" w:after="30"/>
-        <w:ind w:left="720"/>
-      </w:pPr>
-      <w:r>
-        <w:rPr>
-          <w:rFonts w:ascii="맑은 고딕" w:hAnsi="맑은 고딕"/>
-          <w:b/>
-          <w:color w:val="6366F1"/>
-          <w:sz w:val="20"/>
-        </w:rPr>
-        <w:t xml:space="preserve">⁃ </w:t>
-      </w:r>
-      <w:r>
-        <w:rPr>
-          <w:rFonts w:ascii="맑은 고딕" w:hAnsi="맑은 고딕" w:eastAsia="맑은 고딕"/>
-          <w:color w:val="334155"/>
-          <w:sz w:val="20"/>
-        </w:rPr>
-        <w:t>모달 닫기 규칙: 바깥 배경 터치 또는 [취소] 클릭 시에만 닫힘. [상태 기록] 버튼 클릭 시 상태 2로 화면 전환.</w:t>
-      </w:r>
-    </w:p>
-    <w:p>
-      <w:pPr>
-        <w:spacing w:before="30" w:after="30"/>
-        <w:ind w:left="360"/>
-      </w:pPr>
-      <w:r>
-        <w:rPr>
-          <w:rFonts w:ascii="맑은 고딕" w:hAnsi="맑은 고딕"/>
-          <w:b/>
-          <w:color w:val="2563EB"/>
-          <w:sz w:val="20"/>
-        </w:rPr>
-        <w:t xml:space="preserve">2. </w:t>
-      </w:r>
-      <w:r>
-        <w:rPr>
-          <w:rFonts w:ascii="맑은 고딕" w:hAnsi="맑은 고딕" w:eastAsia="맑은 고딕"/>
-          <w:b/>
-          <w:color w:val="334155"/>
-          <w:sz w:val="20"/>
-        </w:rPr>
-        <w:t>`작은 습관 추가` 모달</w:t>
-      </w:r>
-    </w:p>
-    <w:p>
-      <w:pPr>
-        <w:spacing w:before="30" w:after="30"/>
-        <w:ind w:left="720"/>
-      </w:pPr>
-      <w:r>
-        <w:rPr>
-          <w:rFonts w:ascii="맑은 고딕" w:hAnsi="맑은 고딕"/>
-          <w:b/>
-          <w:color w:val="6366F1"/>
-          <w:sz w:val="20"/>
-        </w:rPr>
-        <w:t xml:space="preserve">⁃ </w:t>
-      </w:r>
-      <w:r>
-        <w:rPr>
-          <w:rFonts w:ascii="맑은 고딕" w:hAnsi="맑은 고딕" w:eastAsia="맑은 고딕"/>
-          <w:b/>
-          <w:color w:val="334155"/>
-          <w:sz w:val="20"/>
-        </w:rPr>
-        <w:t>입력 필드 스펙</w:t>
-      </w:r>
-      <w:r>
-        <w:rPr>
-          <w:rFonts w:ascii="맑은 고딕" w:hAnsi="맑은 고딕" w:eastAsia="맑은 고딕"/>
-          <w:color w:val="334155"/>
-          <w:sz w:val="20"/>
-        </w:rPr>
-        <w:t>:</w:t>
-      </w:r>
-    </w:p>
-    <w:p>
-      <w:pPr>
-        <w:spacing w:before="30" w:after="30"/>
-        <w:ind w:left="1080"/>
-      </w:pPr>
-      <w:r>
-        <w:rPr>
-          <w:rFonts w:ascii="맑은 고딕" w:hAnsi="맑은 고딕"/>
-          <w:b/>
-          <w:color w:val="6366F1"/>
-          <w:sz w:val="20"/>
-        </w:rPr>
-        <w:t xml:space="preserve">⁃ </w:t>
-      </w:r>
-      <w:r>
-        <w:rPr>
-          <w:rFonts w:ascii="맑은 고딕" w:hAnsi="맑은 고딕" w:eastAsia="맑은 고딕"/>
-          <w:color w:val="334155"/>
-          <w:sz w:val="20"/>
-        </w:rPr>
-        <w:t>습관명 입력창 (예: 책상 위 물 한 컵)</w:t>
-      </w:r>
-    </w:p>
-    <w:p>
-      <w:pPr>
-        <w:spacing w:before="30" w:after="30"/>
-        <w:ind w:left="1080"/>
-      </w:pPr>
-      <w:r>
-        <w:rPr>
-          <w:rFonts w:ascii="맑은 고딕" w:hAnsi="맑은 고딕"/>
-          <w:b/>
-          <w:color w:val="6366F1"/>
-          <w:sz w:val="20"/>
-        </w:rPr>
-        <w:t xml:space="preserve">⁃ </w:t>
-      </w:r>
-      <w:r>
-        <w:rPr>
-          <w:rFonts w:ascii="맑은 고딕" w:hAnsi="맑은 고딕" w:eastAsia="맑은 고딕"/>
-          <w:color w:val="334155"/>
-          <w:sz w:val="20"/>
-        </w:rPr>
-        <w:t>실천 가이드 텍스트 (예: 언제든 · 1분이라도)</w:t>
-      </w:r>
-    </w:p>
-    <w:p>
-      <w:pPr>
-        <w:spacing w:before="30" w:after="30"/>
-        <w:ind w:left="1080"/>
-      </w:pPr>
-      <w:r>
-        <w:rPr>
-          <w:rFonts w:ascii="맑은 고딕" w:hAnsi="맑은 고딕"/>
-          <w:b/>
-          <w:color w:val="6366F1"/>
-          <w:sz w:val="20"/>
-        </w:rPr>
-        <w:t xml:space="preserve">⁃ </w:t>
-      </w:r>
-      <w:r>
-        <w:rPr>
-          <w:rFonts w:ascii="맑은 고딕" w:hAnsi="맑은 고딕" w:eastAsia="맑은 고딕"/>
-          <w:color w:val="334155"/>
-          <w:sz w:val="20"/>
-        </w:rPr>
-        <w:t xml:space="preserve">목표 빈도 라디오: </w:t>
+        <w:t xml:space="preserve">• </w:t>
+      </w:r>
+      <w:r>
+        <w:rPr>
+          <w:rFonts w:ascii="맑은 고딕" w:hAnsi="맑은 고딕" w:eastAsia="맑은 고딕"/>
+          <w:b/>
+          <w:color w:val="334155"/>
+          <w:sz w:val="20"/>
+        </w:rPr>
+        <w:t>자정 00:00 일일 롤오버</w:t>
+      </w:r>
+      <w:r>
+        <w:rPr>
+          <w:rFonts w:ascii="맑은 고딕" w:hAnsi="맑은 고딕" w:eastAsia="맑은 고딕"/>
+          <w:color w:val="334155"/>
+          <w:sz w:val="20"/>
+        </w:rPr>
+        <w:t>: 전날의 실천 스코어(</w:t>
       </w:r>
       <w:r>
         <w:rPr>
@@ -5955,217 +6224,7 @@
           <w:color w:val="B42846"/>
           <w:sz w:val="19"/>
         </w:rPr>
-        <w:t>[매일]</w:t>
-      </w:r>
-      <w:r>
-        <w:rPr>
-          <w:rFonts w:ascii="맑은 고딕" w:hAnsi="맑은 고딕" w:eastAsia="맑은 고딕"/>
-          <w:color w:val="334155"/>
-          <w:sz w:val="20"/>
-        </w:rPr>
-        <w:t xml:space="preserve"> / </w:t>
-      </w:r>
-      <w:r>
-        <w:rPr>
-          <w:rFonts w:ascii="Consolas" w:hAnsi="Consolas" w:eastAsia="맑은 고딕"/>
-          <w:color w:val="B42846"/>
-          <w:sz w:val="19"/>
-        </w:rPr>
-        <w:t>[주간 자유 빈도 (주 N회)]</w:t>
-      </w:r>
-      <w:r>
-        <w:rPr>
-          <w:rFonts w:ascii="맑은 고딕" w:hAnsi="맑은 고딕" w:eastAsia="맑은 고딕"/>
-          <w:color w:val="334155"/>
-          <w:sz w:val="20"/>
-        </w:rPr>
-        <w:t xml:space="preserve"> / </w:t>
-      </w:r>
-      <w:r>
-        <w:rPr>
-          <w:rFonts w:ascii="Consolas" w:hAnsi="Consolas" w:eastAsia="맑은 고딕"/>
-          <w:color w:val="B42846"/>
-          <w:sz w:val="19"/>
-        </w:rPr>
-        <w:t>[특정 요일 선택]</w:t>
-      </w:r>
-    </w:p>
-    <w:p>
-      <w:pPr>
-        <w:spacing w:before="30" w:after="30"/>
-        <w:ind w:left="1080"/>
-      </w:pPr>
-      <w:r>
-        <w:rPr>
-          <w:rFonts w:ascii="맑은 고딕" w:hAnsi="맑은 고딕"/>
-          <w:b/>
-          <w:color w:val="6366F1"/>
-          <w:sz w:val="20"/>
-        </w:rPr>
-        <w:t xml:space="preserve">⁃ </w:t>
-      </w:r>
-      <w:r>
-        <w:rPr>
-          <w:rFonts w:ascii="맑은 고딕" w:hAnsi="맑은 고딕" w:eastAsia="맑은 고딕"/>
-          <w:color w:val="334155"/>
-          <w:sz w:val="20"/>
-        </w:rPr>
-        <w:t>리마인드 알림 시간대 설정</w:t>
-      </w:r>
-    </w:p>
-    <w:p>
-      <w:pPr>
-        <w:spacing w:before="30" w:after="30"/>
-        <w:ind w:left="720"/>
-      </w:pPr>
-      <w:r>
-        <w:rPr>
-          <w:rFonts w:ascii="맑은 고딕" w:hAnsi="맑은 고딕"/>
-          <w:b/>
-          <w:color w:val="6366F1"/>
-          <w:sz w:val="20"/>
-        </w:rPr>
-        <w:t xml:space="preserve">⁃ </w:t>
-      </w:r>
-      <w:r>
-        <w:rPr>
-          <w:rFonts w:ascii="맑은 고딕" w:hAnsi="맑은 고딕" w:eastAsia="맑은 고딕"/>
-          <w:color w:val="334155"/>
-          <w:sz w:val="20"/>
-        </w:rPr>
-        <w:t>[저장] 버튼 클릭 시 목록 최상단에 새 습관 생성.</w:t>
-      </w:r>
-    </w:p>
-    <w:p>
-      <w:pPr>
-        <w:keepNext/>
-        <w:spacing w:before="160" w:after="60"/>
-      </w:pPr>
-      <w:r>
-        <w:rPr>
-          <w:rFonts w:ascii="맑은 고딕" w:hAnsi="맑은 고딕" w:eastAsia="맑은 고딕"/>
-          <w:b/>
-          <w:color w:val="334155"/>
-          <w:sz w:val="22"/>
-        </w:rPr>
-        <w:t>[비즈니스 로직 &amp; 달성률 계산 공식]</w:t>
-      </w:r>
-    </w:p>
-    <w:p>
-      <w:pPr>
-        <w:spacing w:before="30" w:after="30"/>
-        <w:ind w:left="360"/>
-      </w:pPr>
-      <w:r>
-        <w:rPr>
-          <w:rFonts w:ascii="맑은 고딕" w:hAnsi="맑은 고딕"/>
-          <w:b/>
-          <w:color w:val="6366F1"/>
-          <w:sz w:val="20"/>
-        </w:rPr>
-        <w:t xml:space="preserve">• </w:t>
-      </w:r>
-      <w:r>
-        <w:rPr>
-          <w:rFonts w:ascii="맑은 고딕" w:hAnsi="맑은 고딕" w:eastAsia="맑은 고딕"/>
-          <w:b/>
-          <w:color w:val="334155"/>
-          <w:sz w:val="20"/>
-        </w:rPr>
-        <w:t>일일 습관 달성률 계산 공식</w:t>
-      </w:r>
-      <w:r>
-        <w:rPr>
-          <w:rFonts w:ascii="맑은 고딕" w:hAnsi="맑은 고딕" w:eastAsia="맑은 고딕"/>
-          <w:color w:val="334155"/>
-          <w:sz w:val="20"/>
-        </w:rPr>
-        <w:t>:</w:t>
-      </w:r>
-    </w:p>
-    <w:p>
-      <w:pPr>
-        <w:spacing w:before="50" w:after="70" w:line="300" w:lineRule="auto"/>
-      </w:pPr>
-      <w:r>
-        <w:rPr>
-          <w:rFonts w:ascii="맑은 고딕" w:hAnsi="맑은 고딕" w:eastAsia="맑은 고딕"/>
-          <w:color w:val="334155"/>
-          <w:sz w:val="21"/>
-        </w:rPr>
-        <w:t>$$\text{일일 습관 달성률}(\%) = \frac{\sum (\text{완료 수} \times 1.0 + \text{조금 완료 수} \times 0.5)}{\text{전체 등록 습관 수}} \times 100$$</w:t>
-      </w:r>
-    </w:p>
-    <w:p>
-      <w:pPr>
-        <w:spacing w:before="30" w:after="30"/>
-        <w:ind w:left="360"/>
-      </w:pPr>
-      <w:r>
-        <w:rPr>
-          <w:rFonts w:ascii="맑은 고딕" w:hAnsi="맑은 고딕"/>
-          <w:b/>
-          <w:color w:val="6366F1"/>
-          <w:sz w:val="20"/>
-        </w:rPr>
-        <w:t xml:space="preserve">• </w:t>
-      </w:r>
-      <w:r>
-        <w:rPr>
-          <w:rFonts w:ascii="맑은 고딕" w:hAnsi="맑은 고딕" w:eastAsia="맑은 고딕"/>
-          <w:b/>
-          <w:color w:val="334155"/>
-          <w:sz w:val="20"/>
-        </w:rPr>
-        <w:t>주간 자유 빈도형 습관 계산</w:t>
-      </w:r>
-      <w:r>
-        <w:rPr>
-          <w:rFonts w:ascii="맑은 고딕" w:hAnsi="맑은 고딕" w:eastAsia="맑은 고딕"/>
-          <w:color w:val="334155"/>
-          <w:sz w:val="20"/>
-        </w:rPr>
-        <w:t>: "주 3회 실천" 습관의 경우, 월~일 중 실천한 날짜 횟수가 3회에 도달하면 해당 주차 목표 완료로 판정.</w:t>
-      </w:r>
-    </w:p>
-    <w:p>
-      <w:pPr>
-        <w:spacing w:before="30" w:after="30"/>
-        <w:ind w:left="360"/>
-      </w:pPr>
-      <w:r>
-        <w:rPr>
-          <w:rFonts w:ascii="맑은 고딕" w:hAnsi="맑은 고딕"/>
-          <w:b/>
-          <w:color w:val="6366F1"/>
-          <w:sz w:val="20"/>
-        </w:rPr>
-        <w:t xml:space="preserve">• </w:t>
-      </w:r>
-      <w:r>
-        <w:rPr>
-          <w:rFonts w:ascii="맑은 고딕" w:hAnsi="맑은 고딕" w:eastAsia="맑은 고딕"/>
-          <w:b/>
-          <w:color w:val="334155"/>
-          <w:sz w:val="20"/>
-        </w:rPr>
-        <w:t>자정 00:00 일일 롤오버</w:t>
-      </w:r>
-      <w:r>
-        <w:rPr>
-          <w:rFonts w:ascii="맑은 고딕" w:hAnsi="맑은 고딕" w:eastAsia="맑은 고딕"/>
-          <w:color w:val="334155"/>
-          <w:sz w:val="20"/>
-        </w:rPr>
-        <w:t>: 전날의 실천 스코어(</w:t>
-      </w:r>
-      <w:r>
-        <w:rPr>
-          <w:rFonts w:ascii="Consolas" w:hAnsi="Consolas" w:eastAsia="맑은 고딕"/>
-          <w:color w:val="B42846"/>
-          <w:sz w:val="19"/>
-        </w:rPr>
-        <w:t>1.0 / 0.5 / 0.0</w:t>
+        <w:t>1.0 / 0.5 / 0.0 미실천</w:t>
       </w:r>
       <w:r>
         <w:rPr>
@@ -7610,7 +7669,7 @@
           <w:color w:val="334155"/>
           <w:sz w:val="21"/>
         </w:rPr>
-        <w:t xml:space="preserve">복약 알림의 의학적 강제성(Locked ON)을 유지하면서도, 환자의 알림 피로도를 합리적으로 제어할 수 있도록 </w:t>
+        <w:t xml:space="preserve">복약 알림의 의학적 강제성을 유지하면서도 불필요한 스위치 조작 혼란을 없애고, 환자의 알림 피로도를 합리적으로 제어할 수 있도록 </w:t>
       </w:r>
       <w:r>
         <w:rPr>
@@ -7619,7 +7678,7 @@
           <w:color w:val="334155"/>
           <w:sz w:val="21"/>
         </w:rPr>
-        <w:t>[빈도 조절 1종 + 탭별 알림 3종 + 마스코트 알림 1종 = 총 5대 알림 설정]</w:t>
+        <w:t>[빈도 조절 1종 + 상시 필수 복약 안내 카드 1종 + 기능별 자유 토글 3종 = 총 5대 알림 체계]</w:t>
       </w:r>
       <w:r>
         <w:rPr>
@@ -7627,7 +7686,7 @@
           <w:color w:val="334155"/>
           <w:sz w:val="21"/>
         </w:rPr>
-        <w:t>을 구축함:</w:t>
+        <w:t>를 구축함:</w:t>
       </w:r>
     </w:p>
     <w:p>
@@ -7842,7 +7901,7 @@
           <w:color w:val="334155"/>
           <w:sz w:val="20"/>
         </w:rPr>
-        <w:t xml:space="preserve">: 복약 탭 자체는 OFF가 불가능하므로, 복약 알림을 최소한으로만 받고 싶은 사용자는 이 빈도 설정을 </w:t>
+        <w:t xml:space="preserve">: 복약 알림은 스위치 OFF가 불가하므로, 복약 알림을 최소한으로만 받고 싶은 사용자는 이 빈도 설정을 </w:t>
       </w:r>
       <w:r>
         <w:rPr>
@@ -7883,7 +7942,7 @@
           <w:color w:val="334155"/>
           <w:sz w:val="20"/>
         </w:rPr>
-        <w:t>탭별 알림 ON / OFF (3종)</w:t>
+        <w:t>필수 복약 알림 상시 안내 카드 (스위치 배제, 1종)</w:t>
       </w:r>
       <w:r>
         <w:rPr>
@@ -7915,81 +7974,64 @@
           <w:color w:val="334155"/>
           <w:sz w:val="20"/>
         </w:rPr>
-        <w:t>① 💊 복약 알림</w:t>
-      </w:r>
-      <w:r>
-        <w:rPr>
-          <w:rFonts w:ascii="맑은 고딕" w:hAnsi="맑은 고딕" w:eastAsia="맑은 고딕"/>
-          <w:color w:val="334155"/>
-          <w:sz w:val="20"/>
-        </w:rPr>
-        <w:t xml:space="preserve">: </w:t>
-      </w:r>
-      <w:r>
-        <w:rPr>
-          <w:rFonts w:ascii="맑은 고딕" w:hAnsi="맑은 고딕" w:eastAsia="맑은 고딕"/>
-          <w:b/>
-          <w:color w:val="334155"/>
-          <w:sz w:val="20"/>
-        </w:rPr>
-        <w:t>강제 ON (잠금 🔒, 토글 OFF 불가)</w:t>
-      </w:r>
-      <w:r>
-        <w:rPr>
-          <w:rFonts w:ascii="맑은 고딕" w:hAnsi="맑은 고딕" w:eastAsia="맑은 고딕"/>
-          <w:color w:val="334155"/>
-          <w:sz w:val="20"/>
-        </w:rPr>
-        <w:t>. 치료 농도(Steady-State) 유지를 위해 어떤 경우에도 알림 수신 자체를 끌 수 없음.</w:t>
+        <w:t>💊 복약 알림 (항상 켜짐 · 필수 기본 기능)</w:t>
+      </w:r>
+      <w:r>
+        <w:rPr>
+          <w:rFonts w:ascii="맑은 고딕" w:hAnsi="맑은 고딕" w:eastAsia="맑은 고딕"/>
+          <w:color w:val="334155"/>
+          <w:sz w:val="20"/>
+        </w:rPr>
+        <w:t xml:space="preserve">: 의학적 치료 농도(Steady-State) 유지를 위해 </w:t>
+      </w:r>
+      <w:r>
+        <w:rPr>
+          <w:rFonts w:ascii="맑은 고딕" w:hAnsi="맑은 고딕" w:eastAsia="맑은 고딕"/>
+          <w:b/>
+          <w:color w:val="334155"/>
+          <w:sz w:val="20"/>
+        </w:rPr>
+        <w:t>토글 스위치 자체를 만들지 않고 상시 작동 안내 카드로 고지</w:t>
+      </w:r>
+      <w:r>
+        <w:rPr>
+          <w:rFonts w:ascii="맑은 고딕" w:hAnsi="맑은 고딕" w:eastAsia="맑은 고딕"/>
+          <w:color w:val="334155"/>
+          <w:sz w:val="20"/>
+        </w:rPr>
+        <w:t>함. 꺼지지 않는 잠금 스위치(Disabled)로 인한 조작 혼란이나 시각적 거부감을 원천 차단함.</w:t>
       </w:r>
     </w:p>
     <w:p>
       <w:pPr>
         <w:spacing w:before="30" w:after="30"/>
-        <w:ind w:left="720"/>
+        <w:ind w:left="360"/>
       </w:pPr>
       <w:r>
         <w:rPr>
           <w:rFonts w:ascii="맑은 고딕" w:hAnsi="맑은 고딕"/>
           <w:b/>
-          <w:color w:val="6366F1"/>
-          <w:sz w:val="20"/>
-        </w:rPr>
-        <w:t xml:space="preserve">⁃ </w:t>
-      </w:r>
-      <w:r>
-        <w:rPr>
-          <w:rFonts w:ascii="맑은 고딕" w:hAnsi="맑은 고딕" w:eastAsia="맑은 고딕"/>
-          <w:b/>
-          <w:color w:val="334155"/>
-          <w:sz w:val="20"/>
-        </w:rPr>
-        <w:t>② 🌱 작은 습관 알림</w:t>
-      </w:r>
-      <w:r>
-        <w:rPr>
-          <w:rFonts w:ascii="맑은 고딕" w:hAnsi="맑은 고딕" w:eastAsia="맑은 고딕"/>
-          <w:color w:val="334155"/>
-          <w:sz w:val="20"/>
-        </w:rPr>
-        <w:t xml:space="preserve">: </w:t>
-      </w:r>
-      <w:r>
-        <w:rPr>
-          <w:rFonts w:ascii="맑은 고딕" w:hAnsi="맑은 고딕" w:eastAsia="맑은 고딕"/>
-          <w:b/>
-          <w:color w:val="334155"/>
-          <w:sz w:val="20"/>
-        </w:rPr>
-        <w:t>자유 토글 (ON / OFF)</w:t>
-      </w:r>
-      <w:r>
-        <w:rPr>
-          <w:rFonts w:ascii="맑은 고딕" w:hAnsi="맑은 고딕" w:eastAsia="맑은 고딕"/>
-          <w:color w:val="334155"/>
-          <w:sz w:val="20"/>
-        </w:rPr>
-        <w:t>. 데일리 루틴 실천 시간대 리마인드 알림 수신 여부 선택.</w:t>
+          <w:color w:val="2563EB"/>
+          <w:sz w:val="20"/>
+        </w:rPr>
+        <w:t xml:space="preserve">3. </w:t>
+      </w:r>
+      <w:r>
+        <w:rPr>
+          <w:rFonts w:ascii="맑은 고딕" w:hAnsi="맑은 고딕" w:eastAsia="맑은 고딕"/>
+          <w:b/>
+          <w:color w:val="334155"/>
+          <w:sz w:val="20"/>
+        </w:rPr>
+        <w:t>기능별 자유 토글 알림 (자유 ON / OFF, 3종)</w:t>
+      </w:r>
+      <w:r>
+        <w:rPr>
+          <w:rFonts w:ascii="맑은 고딕" w:hAnsi="맑은 고딕" w:eastAsia="맑은 고딕"/>
+          <w:color w:val="334155"/>
+          <w:sz w:val="20"/>
+        </w:rPr>
+        <w:t>:</w:t>
       </w:r>
     </w:p>
     <w:p>
@@ -8013,64 +8055,47 @@
           <w:color w:val="334155"/>
           <w:sz w:val="20"/>
         </w:rPr>
-        <w:t>③ 🗓️ 달력/할일 알림</w:t>
-      </w:r>
-      <w:r>
-        <w:rPr>
-          <w:rFonts w:ascii="맑은 고딕" w:hAnsi="맑은 고딕" w:eastAsia="맑은 고딕"/>
-          <w:color w:val="334155"/>
-          <w:sz w:val="20"/>
-        </w:rPr>
-        <w:t xml:space="preserve">: </w:t>
-      </w:r>
-      <w:r>
-        <w:rPr>
-          <w:rFonts w:ascii="맑은 고딕" w:hAnsi="맑은 고딕" w:eastAsia="맑은 고딕"/>
-          <w:b/>
-          <w:color w:val="334155"/>
-          <w:sz w:val="20"/>
-        </w:rPr>
-        <w:t>자유 토글 (ON / OFF)</w:t>
-      </w:r>
-      <w:r>
-        <w:rPr>
-          <w:rFonts w:ascii="맑은 고딕" w:hAnsi="맑은 고딕" w:eastAsia="맑은 고딕"/>
-          <w:color w:val="334155"/>
-          <w:sz w:val="20"/>
-        </w:rPr>
-        <w:t>. 등록된 일정 및 과제 마감 30분 전 알림 수신 여부 선택.</w:t>
+        <w:t>① 🌱 작은 습관 알림</w:t>
+      </w:r>
+      <w:r>
+        <w:rPr>
+          <w:rFonts w:ascii="맑은 고딕" w:hAnsi="맑은 고딕" w:eastAsia="맑은 고딕"/>
+          <w:color w:val="334155"/>
+          <w:sz w:val="20"/>
+        </w:rPr>
+        <w:t>: 데일리 루틴 실천 시간대 리마인드 알림 수신 여부 선택.</w:t>
       </w:r>
     </w:p>
     <w:p>
       <w:pPr>
         <w:spacing w:before="30" w:after="30"/>
-        <w:ind w:left="360"/>
+        <w:ind w:left="720"/>
       </w:pPr>
       <w:r>
         <w:rPr>
           <w:rFonts w:ascii="맑은 고딕" w:hAnsi="맑은 고딕"/>
           <w:b/>
-          <w:color w:val="2563EB"/>
-          <w:sz w:val="20"/>
-        </w:rPr>
-        <w:t xml:space="preserve">3. </w:t>
-      </w:r>
-      <w:r>
-        <w:rPr>
-          <w:rFonts w:ascii="맑은 고딕" w:hAnsi="맑은 고딕" w:eastAsia="맑은 고딕"/>
-          <w:b/>
-          <w:color w:val="334155"/>
-          <w:sz w:val="20"/>
-        </w:rPr>
-        <w:t>마스코트 캐릭터 알림 (1종)</w:t>
-      </w:r>
-      <w:r>
-        <w:rPr>
-          <w:rFonts w:ascii="맑은 고딕" w:hAnsi="맑은 고딕" w:eastAsia="맑은 고딕"/>
-          <w:color w:val="334155"/>
-          <w:sz w:val="20"/>
-        </w:rPr>
-        <w:t>:</w:t>
+          <w:color w:val="6366F1"/>
+          <w:sz w:val="20"/>
+        </w:rPr>
+        <w:t xml:space="preserve">⁃ </w:t>
+      </w:r>
+      <w:r>
+        <w:rPr>
+          <w:rFonts w:ascii="맑은 고딕" w:hAnsi="맑은 고딕" w:eastAsia="맑은 고딕"/>
+          <w:b/>
+          <w:color w:val="334155"/>
+          <w:sz w:val="20"/>
+        </w:rPr>
+        <w:t>② 🗓️ 달력/할일 알림</w:t>
+      </w:r>
+      <w:r>
+        <w:rPr>
+          <w:rFonts w:ascii="맑은 고딕" w:hAnsi="맑은 고딕" w:eastAsia="맑은 고딕"/>
+          <w:color w:val="334155"/>
+          <w:sz w:val="20"/>
+        </w:rPr>
+        <w:t>: 등록된 일정 및 과제 마감 30분 전 알림 수신 여부 선택.</w:t>
       </w:r>
     </w:p>
     <w:p>
@@ -8094,32 +8119,15 @@
           <w:color w:val="334155"/>
           <w:sz w:val="20"/>
         </w:rPr>
-        <w:t>④ 🐻 마스코트(하곰이) 응원 및 넛지 알림</w:t>
-      </w:r>
-      <w:r>
-        <w:rPr>
-          <w:rFonts w:ascii="맑은 고딕" w:hAnsi="맑은 고딕" w:eastAsia="맑은 고딕"/>
-          <w:color w:val="334155"/>
-          <w:sz w:val="20"/>
-        </w:rPr>
-        <w:t xml:space="preserve">: </w:t>
-      </w:r>
-      <w:r>
-        <w:rPr>
-          <w:rFonts w:ascii="맑은 고딕" w:hAnsi="맑은 고딕" w:eastAsia="맑은 고딕"/>
-          <w:b/>
-          <w:color w:val="334155"/>
-          <w:sz w:val="20"/>
-        </w:rPr>
-        <w:t>자유 토글 (ON / OFF)</w:t>
-      </w:r>
-      <w:r>
-        <w:rPr>
-          <w:rFonts w:ascii="맑은 고딕" w:hAnsi="맑은 고딕" w:eastAsia="맑은 고딕"/>
-          <w:color w:val="334155"/>
-          <w:sz w:val="20"/>
-        </w:rPr>
-        <w:t>. 앱 미접속 일수(1~3일 애절 모드, 4일 이상 듀오링고식 집착 모드)에 따른 밈 알림 및 데일리 응원 문구 수신 여부 선택.</w:t>
+        <w:t>③ 🐻 마스코트(하곰이) 응원 및 넛지 알림</w:t>
+      </w:r>
+      <w:r>
+        <w:rPr>
+          <w:rFonts w:ascii="맑은 고딕" w:hAnsi="맑은 고딕" w:eastAsia="맑은 고딕"/>
+          <w:color w:val="334155"/>
+          <w:sz w:val="20"/>
+        </w:rPr>
+        <w:t>: 앱 미접속 일수(1~3일 애절 모드, 4일 이상 듀오링고식 집착 모드)에 따른 밈 알림 및 데일리 응원 문구 수신 여부 선택.</w:t>
       </w:r>
     </w:p>
     <w:p>
@@ -8746,7 +8754,7 @@
               <w:br/>
               <w:t xml:space="preserve">  final DateTime date;</w:t>
               <w:br/>
-              <w:t xml:space="preserve">  final double score;           // 1.0(완료), 0.5(조금 함), 0.0(오늘 쉬기)</w:t>
+              <w:t xml:space="preserve">  final double score;           // 1.0(완료), 0.5(조금 함), 0.0(미실천)</w:t>
               <w:br/>
               <w:t xml:space="preserve">  final String status;          // FULL, HALF, REST</w:t>
               <w:br/>
@@ -9750,7 +9758,7 @@
           <w:color w:val="334155"/>
           <w:sz w:val="20"/>
         </w:rPr>
-        <w:t>, 3단 평가(</w:t>
+        <w:t>, 2단 달성 평가(</w:t>
       </w:r>
       <w:r>
         <w:rPr>
@@ -9775,22 +9783,6 @@
           <w:sz w:val="19"/>
         </w:rPr>
         <w:t>조금 함 0.5</w:t>
-      </w:r>
-      <w:r>
-        <w:rPr>
-          <w:rFonts w:ascii="맑은 고딕" w:hAnsi="맑은 고딕" w:eastAsia="맑은 고딕"/>
-          <w:color w:val="334155"/>
-          <w:sz w:val="20"/>
-        </w:rPr>
-        <w:t xml:space="preserve"> / </w:t>
-      </w:r>
-      <w:r>
-        <w:rPr>
-          <w:rFonts w:ascii="Consolas" w:hAnsi="Consolas" w:eastAsia="맑은 고딕"/>
-          <w:color w:val="B42846"/>
-          <w:sz w:val="19"/>
-        </w:rPr>
-        <w:t>오늘 쉬기 0.0</w:t>
       </w:r>
       <w:r>
         <w:rPr>
@@ -11171,7 +11163,7 @@
                 <w:color w:val="334155"/>
                 <w:sz w:val="19"/>
               </w:rPr>
-              <w:t>습관 기호 직관성 개선 (`○`, `●`, `◐`, `⏸`)</w:t>
+              <w:t>습관 기호 직관성 개선 (`○`, `●`, `◐`)</w:t>
             </w:r>
           </w:p>
         </w:tc>
@@ -11195,39 +11187,7 @@
                 <w:color w:val="334155"/>
                 <w:sz w:val="19"/>
               </w:rPr>
-              <w:t xml:space="preserve">혼란을 주던 </w:t>
-            </w:r>
-            <w:r>
-              <w:rPr>
-                <w:rFonts w:ascii="Consolas" w:hAnsi="Consolas" w:eastAsia="맑은 고딕"/>
-                <w:color w:val="B42846"/>
-                <w:sz w:val="18"/>
-              </w:rPr>
-              <w:t>○</w:t>
-            </w:r>
-            <w:r>
-              <w:rPr>
-                <w:rFonts w:ascii="맑은 고딕" w:hAnsi="맑은 고딕" w:eastAsia="맑은 고딕"/>
-                <w:color w:val="334155"/>
-                <w:sz w:val="19"/>
-              </w:rPr>
-              <w:t xml:space="preserve">(완료 오인)와 </w:t>
-            </w:r>
-            <w:r>
-              <w:rPr>
-                <w:rFonts w:ascii="Consolas" w:hAnsi="Consolas" w:eastAsia="맑은 고딕"/>
-                <w:color w:val="B42846"/>
-                <w:sz w:val="18"/>
-              </w:rPr>
-              <w:t>—</w:t>
-            </w:r>
-            <w:r>
-              <w:rPr>
-                <w:rFonts w:ascii="맑은 고딕" w:hAnsi="맑은 고딕" w:eastAsia="맑은 고딕"/>
-                <w:color w:val="334155"/>
-                <w:sz w:val="19"/>
-              </w:rPr>
-              <w:t xml:space="preserve">(미완료 오인)를 폐기하고, 원형 채움 진행도 메타포인 </w:t>
+              <w:t xml:space="preserve">혼란을 주던 기호들을 정리하고, 오늘 쉬기를 배제하여 원형 채움 진행도 메타포인 </w:t>
             </w:r>
             <w:r>
               <w:rPr>
@@ -11236,7 +11196,7 @@
                 <w:color w:val="334155"/>
                 <w:sz w:val="19"/>
               </w:rPr>
-              <w:t>`○`(대기 0%) / `●`(완료 1.0) / `◐`(조금 완료 0.5) / `⏸`(오늘 쉬기 0.0 일시정지)</w:t>
+              <w:t>`○`(대기 0%) / `●`(완료 1.0) / `◐`(조금 완료 0.5)</w:t>
             </w:r>
             <w:r>
               <w:rPr>
@@ -11244,7 +11204,7 @@
                 <w:color w:val="334155"/>
                 <w:sz w:val="19"/>
               </w:rPr>
-              <w:t xml:space="preserve"> 체계로 완벽 개편. (5.2절)</w:t>
+              <w:t xml:space="preserve"> 3단계 체계로 직관화. (5.2절)</w:t>
             </w:r>
           </w:p>
         </w:tc>
@@ -11298,7 +11258,7 @@
                 <w:color w:val="334155"/>
                 <w:sz w:val="19"/>
               </w:rPr>
-              <w:t>설정 탭 5대 알림 통합 제어 센터</w:t>
+              <w:t>설정 탭 5대 알림 통합 제어 센터 (복약 스위치 배제)</w:t>
             </w:r>
           </w:p>
         </w:tc>
@@ -11324,7 +11284,7 @@
                 <w:color w:val="334155"/>
                 <w:sz w:val="19"/>
               </w:rPr>
-              <w:t>[빈도 조절 1종 (최소/기본/적극적) + 탭별 알림 3종(복약 🔒강제ON/습관/할일) + 마스코트 알림 1종 = 총 5대 알림 체계]</w:t>
+              <w:t>[빈도 조절 1종 (최소/기본/적극적) + 필수 복약 안내 카드(스위치 배제) 1종 + 자유 토글 3종(습관/할일/마스코트) = 총 5대 알림 체계]</w:t>
             </w:r>
             <w:r>
               <w:rPr>
@@ -11332,7 +11292,7 @@
                 <w:color w:val="334155"/>
                 <w:sz w:val="19"/>
               </w:rPr>
-              <w:t xml:space="preserve"> 수립. (5.4절)</w:t>
+              <w:t xml:space="preserve"> 및 비처벌적 누적 축하 멘트 공식 반영. (2절, 5.4절)</w:t>
             </w:r>
           </w:p>
         </w:tc>
@@ -11936,7 +11896,7 @@
           <w:color w:val="1E3A8A"/>
           <w:sz w:val="28"/>
         </w:rPr>
-        <w:t>10. AI 개발 보조 스킬 도입 계획 (설치 전 검토)</w:t>
+        <w:t>10. AI 개발 보조 스킬 도입 계획 및 상태</w:t>
       </w:r>
     </w:p>
     <w:p>
@@ -11949,24 +11909,23 @@
           <w:color w:val="334155"/>
           <w:sz w:val="21"/>
         </w:rPr>
-        <w:t xml:space="preserve">아래 항목은 Flutter 앱의 구조·구현·검증 및 사용자 경험을 일관되게 유지하기 위한 AI 코딩 에이전트용 지침 후보임. </w:t>
-      </w:r>
-      <w:r>
-        <w:rPr>
-          <w:rFonts w:ascii="맑은 고딕" w:hAnsi="맑은 고딕" w:eastAsia="맑은 고딕"/>
-          <w:b/>
+        <w:t xml:space="preserve">스킬은 프로젝트 저장소의 </w:t>
+      </w:r>
+      <w:r>
+        <w:rPr>
+          <w:rFonts w:ascii="Consolas" w:hAnsi="Consolas" w:eastAsia="맑은 고딕"/>
+          <w:color w:val="B42846"/>
+          <w:sz w:val="20"/>
+        </w:rPr>
+        <w:t>.agents/skills/</w:t>
+      </w:r>
+      <w:r>
+        <w:rPr>
+          <w:rFonts w:ascii="맑은 고딕" w:hAnsi="맑은 고딕" w:eastAsia="맑은 고딕"/>
           <w:color w:val="334155"/>
           <w:sz w:val="21"/>
         </w:rPr>
-        <w:t>현재 설치·도입하지 않았으며</w:t>
-      </w:r>
-      <w:r>
-        <w:rPr>
-          <w:rFonts w:ascii="맑은 고딕" w:hAnsi="맑은 고딕" w:eastAsia="맑은 고딕"/>
-          <w:color w:val="334155"/>
-          <w:sz w:val="21"/>
-        </w:rPr>
-        <w:t>, 실제 사용 전 각 저장소의 출처, 라이선스, 유지보수 상태, 내용 및 보안 위험을 확인하고 프로젝트 요구사항과 대조할 것. 스킬은 개발 지침일 뿐 테스트나 코드 리뷰를 대체하지 않음.</w:t>
+        <w:t>에 두어 지원하는 여러 AI 코딩 도구에서 참고할 수 있게 함. 다운로드되어도 도구가 자동으로 불러오거나 따르리라는 보장은 없으며, 실제 코드 검토와 테스트를 대체하지 않음. 미도입 후보는 저장소·라이선스·유지보수·내용을 확인한 뒤 필요할 때만 추가함.</w:t>
       </w:r>
     </w:p>
     <w:tbl>
@@ -12141,23 +12100,7 @@
                 <w:color w:val="B42846"/>
                 <w:sz w:val="18"/>
               </w:rPr>
-              <w:t>flutter-ai-rules</w:t>
-            </w:r>
-            <w:r>
-              <w:rPr>
-                <w:rFonts w:ascii="맑은 고딕" w:hAnsi="맑은 고딕" w:eastAsia="맑은 고딕"/>
-                <w:color w:val="334155"/>
-                <w:sz w:val="19"/>
-              </w:rPr>
-              <w:t xml:space="preserve"> / </w:t>
-            </w:r>
-            <w:r>
-              <w:rPr>
-                <w:rFonts w:ascii="Consolas" w:hAnsi="Consolas" w:eastAsia="맑은 고딕"/>
-                <w:color w:val="B42846"/>
-                <w:sz w:val="18"/>
-              </w:rPr>
-              <w:t>flutter-skills</w:t>
+              <w:t>flutter-best-practices</w:t>
             </w:r>
           </w:p>
         </w:tc>
@@ -12181,7 +12124,7 @@
                 <w:color w:val="334155"/>
                 <w:sz w:val="19"/>
               </w:rPr>
-              <w:t>Flutter/Dart 구현 시 일관된 코딩 규칙과 흔한 비동기·위젯 관련 실수 방지 지침 제공</w:t>
+              <w:t>Flutter/Dart 구현 관례와 위젯·비동기 코드 작성 지침 제공</w:t>
             </w:r>
           </w:p>
         </w:tc>
@@ -12205,7 +12148,7 @@
                 <w:color w:val="334155"/>
                 <w:sz w:val="19"/>
               </w:rPr>
-              <w:t>검토 후 도입 후보</w:t>
+              <w:t>다운로드 완료</w:t>
             </w:r>
           </w:p>
         </w:tc>
@@ -12257,7 +12200,7 @@
                 <w:color w:val="B42846"/>
                 <w:sz w:val="18"/>
               </w:rPr>
-              <w:t>flutter-clean-architecture</w:t>
+              <w:t>flutter-app-architecture</w:t>
             </w:r>
           </w:p>
         </w:tc>
@@ -12282,7 +12225,7 @@
                 <w:color w:val="334155"/>
                 <w:sz w:val="19"/>
               </w:rPr>
-              <w:t>UI, 도메인 로직, 데이터 접근 책임을 분리해 기능 간 결합을 낮추는 구조 지침 제공</w:t>
+              <w:t>UI·로직·데이터 접근 책임을 분리하는 구조 지침 제공</w:t>
             </w:r>
           </w:p>
         </w:tc>
@@ -12307,7 +12250,639 @@
                 <w:color w:val="334155"/>
                 <w:sz w:val="19"/>
               </w:rPr>
-              <w:t>검토 후 도입 후보</w:t>
+              <w:t>다운로드 완료</w:t>
+            </w:r>
+          </w:p>
+        </w:tc>
+      </w:tr>
+      <w:tr>
+        <w:tc>
+          <w:tcPr>
+            <w:tcW w:type="dxa" w:w="2340"/>
+            <w:tcMar>
+              <w:top w:w="100" w:type="dxa"/>
+              <w:bottom w:w="100" w:type="dxa"/>
+              <w:left w:w="140" w:type="dxa"/>
+              <w:right w:w="140" w:type="dxa"/>
+            </w:tcMar>
+          </w:tcPr>
+          <w:p>
+            <w:pPr>
+              <w:spacing w:before="40" w:after="40"/>
+            </w:pPr>
+            <w:r>
+              <w:rPr>
+                <w:rFonts w:ascii="맑은 고딕" w:hAnsi="맑은 고딕" w:eastAsia="맑은 고딕"/>
+                <w:color w:val="334155"/>
+                <w:sz w:val="19"/>
+              </w:rPr>
+              <w:t>상태 관리</w:t>
+            </w:r>
+          </w:p>
+        </w:tc>
+        <w:tc>
+          <w:tcPr>
+            <w:tcW w:type="dxa" w:w="2340"/>
+            <w:tcMar>
+              <w:top w:w="100" w:type="dxa"/>
+              <w:bottom w:w="100" w:type="dxa"/>
+              <w:left w:w="140" w:type="dxa"/>
+              <w:right w:w="140" w:type="dxa"/>
+            </w:tcMar>
+          </w:tcPr>
+          <w:p>
+            <w:pPr>
+              <w:spacing w:before="40" w:after="40"/>
+            </w:pPr>
+            <w:r>
+              <w:rPr>
+                <w:rFonts w:ascii="Consolas" w:hAnsi="Consolas" w:eastAsia="맑은 고딕"/>
+                <w:color w:val="B42846"/>
+                <w:sz w:val="18"/>
+              </w:rPr>
+              <w:t>flutter-riverpod</w:t>
+            </w:r>
+          </w:p>
+        </w:tc>
+        <w:tc>
+          <w:tcPr>
+            <w:tcW w:type="dxa" w:w="2340"/>
+            <w:tcMar>
+              <w:top w:w="100" w:type="dxa"/>
+              <w:bottom w:w="100" w:type="dxa"/>
+              <w:left w:w="140" w:type="dxa"/>
+              <w:right w:w="140" w:type="dxa"/>
+            </w:tcMar>
+          </w:tcPr>
+          <w:p>
+            <w:pPr>
+              <w:spacing w:before="40" w:after="40"/>
+            </w:pPr>
+            <w:r>
+              <w:rPr>
+                <w:rFonts w:ascii="맑은 고딕" w:hAnsi="맑은 고딕" w:eastAsia="맑은 고딕"/>
+                <w:color w:val="334155"/>
+                <w:sz w:val="19"/>
+              </w:rPr>
+              <w:t>Riverpod 상태 구성·갱신·테스트 지침 제공</w:t>
+            </w:r>
+          </w:p>
+        </w:tc>
+        <w:tc>
+          <w:tcPr>
+            <w:tcW w:type="dxa" w:w="2340"/>
+            <w:tcMar>
+              <w:top w:w="100" w:type="dxa"/>
+              <w:bottom w:w="100" w:type="dxa"/>
+              <w:left w:w="140" w:type="dxa"/>
+              <w:right w:w="140" w:type="dxa"/>
+            </w:tcMar>
+          </w:tcPr>
+          <w:p>
+            <w:pPr>
+              <w:spacing w:before="40" w:after="40"/>
+            </w:pPr>
+            <w:r>
+              <w:rPr>
+                <w:rFonts w:ascii="맑은 고딕" w:hAnsi="맑은 고딕" w:eastAsia="맑은 고딕"/>
+                <w:color w:val="334155"/>
+                <w:sz w:val="19"/>
+              </w:rPr>
+              <w:t>다운로드 완료</w:t>
+            </w:r>
+          </w:p>
+        </w:tc>
+      </w:tr>
+      <w:tr>
+        <w:tc>
+          <w:tcPr>
+            <w:tcW w:type="dxa" w:w="2340"/>
+            <w:shd w:fill="F8FAFC"/>
+            <w:tcMar>
+              <w:top w:w="100" w:type="dxa"/>
+              <w:bottom w:w="100" w:type="dxa"/>
+              <w:left w:w="140" w:type="dxa"/>
+              <w:right w:w="140" w:type="dxa"/>
+            </w:tcMar>
+          </w:tcPr>
+          <w:p>
+            <w:pPr>
+              <w:spacing w:before="40" w:after="40"/>
+            </w:pPr>
+            <w:r>
+              <w:rPr>
+                <w:rFonts w:ascii="맑은 고딕" w:hAnsi="맑은 고딕" w:eastAsia="맑은 고딕"/>
+                <w:color w:val="334155"/>
+                <w:sz w:val="19"/>
+              </w:rPr>
+              <w:t>Firebase</w:t>
+            </w:r>
+          </w:p>
+        </w:tc>
+        <w:tc>
+          <w:tcPr>
+            <w:tcW w:type="dxa" w:w="2340"/>
+            <w:shd w:fill="F8FAFC"/>
+            <w:tcMar>
+              <w:top w:w="100" w:type="dxa"/>
+              <w:bottom w:w="100" w:type="dxa"/>
+              <w:left w:w="140" w:type="dxa"/>
+              <w:right w:w="140" w:type="dxa"/>
+            </w:tcMar>
+          </w:tcPr>
+          <w:p>
+            <w:pPr>
+              <w:spacing w:before="40" w:after="40"/>
+            </w:pPr>
+            <w:r>
+              <w:rPr>
+                <w:rFonts w:ascii="Consolas" w:hAnsi="Consolas" w:eastAsia="맑은 고딕"/>
+                <w:color w:val="B42846"/>
+                <w:sz w:val="18"/>
+              </w:rPr>
+              <w:t>flutterfire-configure</w:t>
+            </w:r>
+            <w:r>
+              <w:rPr>
+                <w:rFonts w:ascii="맑은 고딕" w:hAnsi="맑은 고딕" w:eastAsia="맑은 고딕"/>
+                <w:color w:val="334155"/>
+                <w:sz w:val="19"/>
+              </w:rPr>
+              <w:t xml:space="preserve">, </w:t>
+            </w:r>
+            <w:r>
+              <w:rPr>
+                <w:rFonts w:ascii="Consolas" w:hAnsi="Consolas" w:eastAsia="맑은 고딕"/>
+                <w:color w:val="B42846"/>
+                <w:sz w:val="18"/>
+              </w:rPr>
+              <w:t>flutter-auth</w:t>
+            </w:r>
+            <w:r>
+              <w:rPr>
+                <w:rFonts w:ascii="맑은 고딕" w:hAnsi="맑은 고딕" w:eastAsia="맑은 고딕"/>
+                <w:color w:val="334155"/>
+                <w:sz w:val="19"/>
+              </w:rPr>
+              <w:t xml:space="preserve">, </w:t>
+            </w:r>
+            <w:r>
+              <w:rPr>
+                <w:rFonts w:ascii="Consolas" w:hAnsi="Consolas" w:eastAsia="맑은 고딕"/>
+                <w:color w:val="B42846"/>
+                <w:sz w:val="18"/>
+              </w:rPr>
+              <w:t>flutter-firestore</w:t>
+            </w:r>
+          </w:p>
+        </w:tc>
+        <w:tc>
+          <w:tcPr>
+            <w:tcW w:type="dxa" w:w="2340"/>
+            <w:shd w:fill="F8FAFC"/>
+            <w:tcMar>
+              <w:top w:w="100" w:type="dxa"/>
+              <w:bottom w:w="100" w:type="dxa"/>
+              <w:left w:w="140" w:type="dxa"/>
+              <w:right w:w="140" w:type="dxa"/>
+            </w:tcMar>
+          </w:tcPr>
+          <w:p>
+            <w:pPr>
+              <w:spacing w:before="40" w:after="40"/>
+            </w:pPr>
+            <w:r>
+              <w:rPr>
+                <w:rFonts w:ascii="맑은 고딕" w:hAnsi="맑은 고딕" w:eastAsia="맑은 고딕"/>
+                <w:color w:val="334155"/>
+                <w:sz w:val="19"/>
+              </w:rPr>
+              <w:t>Firebase 초기 설정, 인증, Firestore 연동 지침 제공</w:t>
+            </w:r>
+          </w:p>
+        </w:tc>
+        <w:tc>
+          <w:tcPr>
+            <w:tcW w:type="dxa" w:w="2340"/>
+            <w:shd w:fill="F8FAFC"/>
+            <w:tcMar>
+              <w:top w:w="100" w:type="dxa"/>
+              <w:bottom w:w="100" w:type="dxa"/>
+              <w:left w:w="140" w:type="dxa"/>
+              <w:right w:w="140" w:type="dxa"/>
+            </w:tcMar>
+          </w:tcPr>
+          <w:p>
+            <w:pPr>
+              <w:spacing w:before="40" w:after="40"/>
+            </w:pPr>
+            <w:r>
+              <w:rPr>
+                <w:rFonts w:ascii="맑은 고딕" w:hAnsi="맑은 고딕" w:eastAsia="맑은 고딕"/>
+                <w:color w:val="334155"/>
+                <w:sz w:val="19"/>
+              </w:rPr>
+              <w:t>다운로드 완료</w:t>
+            </w:r>
+          </w:p>
+        </w:tc>
+      </w:tr>
+      <w:tr>
+        <w:tc>
+          <w:tcPr>
+            <w:tcW w:type="dxa" w:w="2340"/>
+            <w:tcMar>
+              <w:top w:w="100" w:type="dxa"/>
+              <w:bottom w:w="100" w:type="dxa"/>
+              <w:left w:w="140" w:type="dxa"/>
+              <w:right w:w="140" w:type="dxa"/>
+            </w:tcMar>
+          </w:tcPr>
+          <w:p>
+            <w:pPr>
+              <w:spacing w:before="40" w:after="40"/>
+            </w:pPr>
+            <w:r>
+              <w:rPr>
+                <w:rFonts w:ascii="맑은 고딕" w:hAnsi="맑은 고딕" w:eastAsia="맑은 고딕"/>
+                <w:color w:val="334155"/>
+                <w:sz w:val="19"/>
+              </w:rPr>
+              <w:t>Figma 구현</w:t>
+            </w:r>
+          </w:p>
+        </w:tc>
+        <w:tc>
+          <w:tcPr>
+            <w:tcW w:type="dxa" w:w="2340"/>
+            <w:tcMar>
+              <w:top w:w="100" w:type="dxa"/>
+              <w:bottom w:w="100" w:type="dxa"/>
+              <w:left w:w="140" w:type="dxa"/>
+              <w:right w:w="140" w:type="dxa"/>
+            </w:tcMar>
+          </w:tcPr>
+          <w:p>
+            <w:pPr>
+              <w:spacing w:before="40" w:after="40"/>
+            </w:pPr>
+            <w:r>
+              <w:rPr>
+                <w:rFonts w:ascii="Consolas" w:hAnsi="Consolas" w:eastAsia="맑은 고딕"/>
+                <w:color w:val="B42846"/>
+                <w:sz w:val="18"/>
+              </w:rPr>
+              <w:t>figma-to-flutter</w:t>
+            </w:r>
+          </w:p>
+        </w:tc>
+        <w:tc>
+          <w:tcPr>
+            <w:tcW w:type="dxa" w:w="2340"/>
+            <w:tcMar>
+              <w:top w:w="100" w:type="dxa"/>
+              <w:bottom w:w="100" w:type="dxa"/>
+              <w:left w:w="140" w:type="dxa"/>
+              <w:right w:w="140" w:type="dxa"/>
+            </w:tcMar>
+          </w:tcPr>
+          <w:p>
+            <w:pPr>
+              <w:spacing w:before="40" w:after="40"/>
+            </w:pPr>
+            <w:r>
+              <w:rPr>
+                <w:rFonts w:ascii="맑은 고딕" w:hAnsi="맑은 고딕" w:eastAsia="맑은 고딕"/>
+                <w:color w:val="334155"/>
+                <w:sz w:val="19"/>
+              </w:rPr>
+              <w:t>Figma 디자인을 Flutter UI로 옮기는 작업 지원</w:t>
+            </w:r>
+          </w:p>
+        </w:tc>
+        <w:tc>
+          <w:tcPr>
+            <w:tcW w:type="dxa" w:w="2340"/>
+            <w:tcMar>
+              <w:top w:w="100" w:type="dxa"/>
+              <w:bottom w:w="100" w:type="dxa"/>
+              <w:left w:w="140" w:type="dxa"/>
+              <w:right w:w="140" w:type="dxa"/>
+            </w:tcMar>
+          </w:tcPr>
+          <w:p>
+            <w:pPr>
+              <w:spacing w:before="40" w:after="40"/>
+            </w:pPr>
+            <w:r>
+              <w:rPr>
+                <w:rFonts w:ascii="맑은 고딕" w:hAnsi="맑은 고딕" w:eastAsia="맑은 고딕"/>
+                <w:color w:val="334155"/>
+                <w:sz w:val="19"/>
+              </w:rPr>
+              <w:t>다운로드 완료</w:t>
+            </w:r>
+          </w:p>
+        </w:tc>
+      </w:tr>
+      <w:tr>
+        <w:tc>
+          <w:tcPr>
+            <w:tcW w:type="dxa" w:w="2340"/>
+            <w:shd w:fill="F8FAFC"/>
+            <w:tcMar>
+              <w:top w:w="100" w:type="dxa"/>
+              <w:bottom w:w="100" w:type="dxa"/>
+              <w:left w:w="140" w:type="dxa"/>
+              <w:right w:w="140" w:type="dxa"/>
+            </w:tcMar>
+          </w:tcPr>
+          <w:p>
+            <w:pPr>
+              <w:spacing w:before="40" w:after="40"/>
+            </w:pPr>
+            <w:r>
+              <w:rPr>
+                <w:rFonts w:ascii="맑은 고딕" w:hAnsi="맑은 고딕" w:eastAsia="맑은 고딕"/>
+                <w:color w:val="334155"/>
+                <w:sz w:val="19"/>
+              </w:rPr>
+              <w:t>테스트</w:t>
+            </w:r>
+          </w:p>
+        </w:tc>
+        <w:tc>
+          <w:tcPr>
+            <w:tcW w:type="dxa" w:w="2340"/>
+            <w:shd w:fill="F8FAFC"/>
+            <w:tcMar>
+              <w:top w:w="100" w:type="dxa"/>
+              <w:bottom w:w="100" w:type="dxa"/>
+              <w:left w:w="140" w:type="dxa"/>
+              <w:right w:w="140" w:type="dxa"/>
+            </w:tcMar>
+          </w:tcPr>
+          <w:p>
+            <w:pPr>
+              <w:spacing w:before="40" w:after="40"/>
+            </w:pPr>
+            <w:r>
+              <w:rPr>
+                <w:rFonts w:ascii="Consolas" w:hAnsi="Consolas" w:eastAsia="맑은 고딕"/>
+                <w:color w:val="B42846"/>
+                <w:sz w:val="18"/>
+              </w:rPr>
+              <w:t>flutter-testing</w:t>
+            </w:r>
+          </w:p>
+        </w:tc>
+        <w:tc>
+          <w:tcPr>
+            <w:tcW w:type="dxa" w:w="2340"/>
+            <w:shd w:fill="F8FAFC"/>
+            <w:tcMar>
+              <w:top w:w="100" w:type="dxa"/>
+              <w:bottom w:w="100" w:type="dxa"/>
+              <w:left w:w="140" w:type="dxa"/>
+              <w:right w:w="140" w:type="dxa"/>
+            </w:tcMar>
+          </w:tcPr>
+          <w:p>
+            <w:pPr>
+              <w:spacing w:before="40" w:after="40"/>
+            </w:pPr>
+            <w:r>
+              <w:rPr>
+                <w:rFonts w:ascii="맑은 고딕" w:hAnsi="맑은 고딕" w:eastAsia="맑은 고딕"/>
+                <w:color w:val="334155"/>
+                <w:sz w:val="19"/>
+              </w:rPr>
+              <w:t>Flutter 단위·위젯 테스트 작성 지침 제공</w:t>
+            </w:r>
+          </w:p>
+        </w:tc>
+        <w:tc>
+          <w:tcPr>
+            <w:tcW w:type="dxa" w:w="2340"/>
+            <w:shd w:fill="F8FAFC"/>
+            <w:tcMar>
+              <w:top w:w="100" w:type="dxa"/>
+              <w:bottom w:w="100" w:type="dxa"/>
+              <w:left w:w="140" w:type="dxa"/>
+              <w:right w:w="140" w:type="dxa"/>
+            </w:tcMar>
+          </w:tcPr>
+          <w:p>
+            <w:pPr>
+              <w:spacing w:before="40" w:after="40"/>
+            </w:pPr>
+            <w:r>
+              <w:rPr>
+                <w:rFonts w:ascii="맑은 고딕" w:hAnsi="맑은 고딕" w:eastAsia="맑은 고딕"/>
+                <w:color w:val="334155"/>
+                <w:sz w:val="19"/>
+              </w:rPr>
+              <w:t>다운로드 완료</w:t>
+            </w:r>
+          </w:p>
+        </w:tc>
+      </w:tr>
+      <w:tr>
+        <w:tc>
+          <w:tcPr>
+            <w:tcW w:type="dxa" w:w="2340"/>
+            <w:tcMar>
+              <w:top w:w="100" w:type="dxa"/>
+              <w:bottom w:w="100" w:type="dxa"/>
+              <w:left w:w="140" w:type="dxa"/>
+              <w:right w:w="140" w:type="dxa"/>
+            </w:tcMar>
+          </w:tcPr>
+          <w:p>
+            <w:pPr>
+              <w:spacing w:before="40" w:after="40"/>
+            </w:pPr>
+            <w:r>
+              <w:rPr>
+                <w:rFonts w:ascii="맑은 고딕" w:hAnsi="맑은 고딕" w:eastAsia="맑은 고딕"/>
+                <w:color w:val="334155"/>
+                <w:sz w:val="19"/>
+              </w:rPr>
+              <w:t>문서 문체</w:t>
+            </w:r>
+          </w:p>
+        </w:tc>
+        <w:tc>
+          <w:tcPr>
+            <w:tcW w:type="dxa" w:w="2340"/>
+            <w:tcMar>
+              <w:top w:w="100" w:type="dxa"/>
+              <w:bottom w:w="100" w:type="dxa"/>
+              <w:left w:w="140" w:type="dxa"/>
+              <w:right w:w="140" w:type="dxa"/>
+            </w:tcMar>
+          </w:tcPr>
+          <w:p>
+            <w:pPr>
+              <w:spacing w:before="40" w:after="40"/>
+            </w:pPr>
+            <w:r>
+              <w:rPr>
+                <w:rFonts w:ascii="Consolas" w:hAnsi="Consolas" w:eastAsia="맑은 고딕"/>
+                <w:color w:val="B42846"/>
+                <w:sz w:val="18"/>
+              </w:rPr>
+              <w:t>humanizer</w:t>
+            </w:r>
+          </w:p>
+        </w:tc>
+        <w:tc>
+          <w:tcPr>
+            <w:tcW w:type="dxa" w:w="2340"/>
+            <w:tcMar>
+              <w:top w:w="100" w:type="dxa"/>
+              <w:bottom w:w="100" w:type="dxa"/>
+              <w:left w:w="140" w:type="dxa"/>
+              <w:right w:w="140" w:type="dxa"/>
+            </w:tcMar>
+          </w:tcPr>
+          <w:p>
+            <w:pPr>
+              <w:spacing w:before="40" w:after="40"/>
+            </w:pPr>
+            <w:r>
+              <w:rPr>
+                <w:rFonts w:ascii="맑은 고딕" w:hAnsi="맑은 고딕" w:eastAsia="맑은 고딕"/>
+                <w:color w:val="334155"/>
+                <w:sz w:val="19"/>
+              </w:rPr>
+              <w:t>문서 초안을 자연스럽고 읽기 쉽게 다듬되, 원래 의미와 근거를 보존하도록 지원</w:t>
+            </w:r>
+          </w:p>
+        </w:tc>
+        <w:tc>
+          <w:tcPr>
+            <w:tcW w:type="dxa" w:w="2340"/>
+            <w:tcMar>
+              <w:top w:w="100" w:type="dxa"/>
+              <w:bottom w:w="100" w:type="dxa"/>
+              <w:left w:w="140" w:type="dxa"/>
+              <w:right w:w="140" w:type="dxa"/>
+            </w:tcMar>
+          </w:tcPr>
+          <w:p>
+            <w:pPr>
+              <w:spacing w:before="40" w:after="40"/>
+            </w:pPr>
+            <w:r>
+              <w:rPr>
+                <w:rFonts w:ascii="맑은 고딕" w:hAnsi="맑은 고딕" w:eastAsia="맑은 고딕"/>
+                <w:color w:val="334155"/>
+                <w:sz w:val="19"/>
+              </w:rPr>
+              <w:t>다운로드 완료; 문서 산문에만 사용</w:t>
+            </w:r>
+          </w:p>
+        </w:tc>
+      </w:tr>
+      <w:tr>
+        <w:tc>
+          <w:tcPr>
+            <w:tcW w:type="dxa" w:w="2340"/>
+            <w:shd w:fill="F8FAFC"/>
+            <w:tcMar>
+              <w:top w:w="100" w:type="dxa"/>
+              <w:bottom w:w="100" w:type="dxa"/>
+              <w:left w:w="140" w:type="dxa"/>
+              <w:right w:w="140" w:type="dxa"/>
+            </w:tcMar>
+          </w:tcPr>
+          <w:p>
+            <w:pPr>
+              <w:spacing w:before="40" w:after="40"/>
+            </w:pPr>
+            <w:r>
+              <w:rPr>
+                <w:rFonts w:ascii="맑은 고딕" w:hAnsi="맑은 고딕" w:eastAsia="맑은 고딕"/>
+                <w:color w:val="334155"/>
+                <w:sz w:val="19"/>
+              </w:rPr>
+              <w:t>Flutter 접근성</w:t>
+            </w:r>
+          </w:p>
+        </w:tc>
+        <w:tc>
+          <w:tcPr>
+            <w:tcW w:type="dxa" w:w="2340"/>
+            <w:shd w:fill="F8FAFC"/>
+            <w:tcMar>
+              <w:top w:w="100" w:type="dxa"/>
+              <w:bottom w:w="100" w:type="dxa"/>
+              <w:left w:w="140" w:type="dxa"/>
+              <w:right w:w="140" w:type="dxa"/>
+            </w:tcMar>
+          </w:tcPr>
+          <w:p>
+            <w:pPr>
+              <w:spacing w:before="40" w:after="40"/>
+            </w:pPr>
+            <w:r>
+              <w:rPr>
+                <w:rFonts w:ascii="Consolas" w:hAnsi="Consolas" w:eastAsia="맑은 고딕"/>
+                <w:color w:val="B42846"/>
+                <w:sz w:val="18"/>
+              </w:rPr>
+              <w:t>accessibility-as-code</w:t>
+            </w:r>
+          </w:p>
+        </w:tc>
+        <w:tc>
+          <w:tcPr>
+            <w:tcW w:type="dxa" w:w="2340"/>
+            <w:shd w:fill="F8FAFC"/>
+            <w:tcMar>
+              <w:top w:w="100" w:type="dxa"/>
+              <w:bottom w:w="100" w:type="dxa"/>
+              <w:left w:w="140" w:type="dxa"/>
+              <w:right w:w="140" w:type="dxa"/>
+            </w:tcMar>
+          </w:tcPr>
+          <w:p>
+            <w:pPr>
+              <w:spacing w:before="40" w:after="40"/>
+            </w:pPr>
+            <w:r>
+              <w:rPr>
+                <w:rFonts w:ascii="맑은 고딕" w:hAnsi="맑은 고딕" w:eastAsia="맑은 고딕"/>
+                <w:color w:val="334155"/>
+                <w:sz w:val="19"/>
+              </w:rPr>
+              <w:t>Semantics 라벨, 화면 읽기 지원, 텍스트 확대, 색상 외 상태 표현, 대비·터치 영역 지침 제공</w:t>
+            </w:r>
+          </w:p>
+        </w:tc>
+        <w:tc>
+          <w:tcPr>
+            <w:tcW w:type="dxa" w:w="2340"/>
+            <w:shd w:fill="F8FAFC"/>
+            <w:tcMar>
+              <w:top w:w="100" w:type="dxa"/>
+              <w:bottom w:w="100" w:type="dxa"/>
+              <w:left w:w="140" w:type="dxa"/>
+              <w:right w:w="140" w:type="dxa"/>
+            </w:tcMar>
+          </w:tcPr>
+          <w:p>
+            <w:pPr>
+              <w:spacing w:before="40" w:after="40"/>
+            </w:pPr>
+            <w:r>
+              <w:rPr>
+                <w:rFonts w:ascii="맑은 고딕" w:hAnsi="맑은 고딕" w:eastAsia="맑은 고딕"/>
+                <w:color w:val="334155"/>
+                <w:sz w:val="19"/>
+              </w:rPr>
+              <w:t>다운로드 완료; 화면 구현·검토에 사용</w:t>
             </w:r>
           </w:p>
         </w:tc>
@@ -12381,7 +12956,7 @@
                 <w:color w:val="334155"/>
                 <w:sz w:val="19"/>
               </w:rPr>
-              <w:t>로컬 저장소와 원격 데이터 간 동기화 및 오프라인 우선 처리 패턴 지침 제공</w:t>
+              <w:t>로컬 저장과 원격 동기화 패턴 후보</w:t>
             </w:r>
           </w:p>
         </w:tc>
@@ -12405,7 +12980,7 @@
                 <w:color w:val="334155"/>
                 <w:sz w:val="19"/>
               </w:rPr>
-              <w:t>Firebase 동기화 구현 전 검토</w:t>
+              <w:t>미다운로드; 현재 로컬 저장·Firebase 요구사항에 맞춰 필요성을 먼저 검토</w:t>
             </w:r>
           </w:p>
         </w:tc>
@@ -12432,207 +13007,7 @@
                 <w:color w:val="334155"/>
                 <w:sz w:val="19"/>
               </w:rPr>
-              <w:t>상태 관리</w:t>
-            </w:r>
-          </w:p>
-        </w:tc>
-        <w:tc>
-          <w:tcPr>
-            <w:tcW w:type="dxa" w:w="2340"/>
-            <w:shd w:fill="F8FAFC"/>
-            <w:tcMar>
-              <w:top w:w="100" w:type="dxa"/>
-              <w:bottom w:w="100" w:type="dxa"/>
-              <w:left w:w="140" w:type="dxa"/>
-              <w:right w:w="140" w:type="dxa"/>
-            </w:tcMar>
-          </w:tcPr>
-          <w:p>
-            <w:pPr>
-              <w:spacing w:before="40" w:after="40"/>
-            </w:pPr>
-            <w:r>
-              <w:rPr>
-                <w:rFonts w:ascii="Consolas" w:hAnsi="Consolas" w:eastAsia="맑은 고딕"/>
-                <w:color w:val="B42846"/>
-                <w:sz w:val="18"/>
-              </w:rPr>
-              <w:t>flutter-state-management-best-practices</w:t>
-            </w:r>
-          </w:p>
-        </w:tc>
-        <w:tc>
-          <w:tcPr>
-            <w:tcW w:type="dxa" w:w="2340"/>
-            <w:shd w:fill="F8FAFC"/>
-            <w:tcMar>
-              <w:top w:w="100" w:type="dxa"/>
-              <w:bottom w:w="100" w:type="dxa"/>
-              <w:left w:w="140" w:type="dxa"/>
-              <w:right w:w="140" w:type="dxa"/>
-            </w:tcMar>
-          </w:tcPr>
-          <w:p>
-            <w:pPr>
-              <w:spacing w:before="40" w:after="40"/>
-            </w:pPr>
-            <w:r>
-              <w:rPr>
-                <w:rFonts w:ascii="맑은 고딕" w:hAnsi="맑은 고딕" w:eastAsia="맑은 고딕"/>
-                <w:color w:val="334155"/>
-                <w:sz w:val="19"/>
-              </w:rPr>
-              <w:t>Riverpod 등 상태 관리의 구성·갱신·테스트 패턴을 일관되게 유지하도록 지원</w:t>
-            </w:r>
-          </w:p>
-        </w:tc>
-        <w:tc>
-          <w:tcPr>
-            <w:tcW w:type="dxa" w:w="2340"/>
-            <w:shd w:fill="F8FAFC"/>
-            <w:tcMar>
-              <w:top w:w="100" w:type="dxa"/>
-              <w:bottom w:w="100" w:type="dxa"/>
-              <w:left w:w="140" w:type="dxa"/>
-              <w:right w:w="140" w:type="dxa"/>
-            </w:tcMar>
-          </w:tcPr>
-          <w:p>
-            <w:pPr>
-              <w:spacing w:before="40" w:after="40"/>
-            </w:pPr>
-            <w:r>
-              <w:rPr>
-                <w:rFonts w:ascii="맑은 고딕" w:hAnsi="맑은 고딕" w:eastAsia="맑은 고딕"/>
-                <w:color w:val="334155"/>
-                <w:sz w:val="19"/>
-              </w:rPr>
-              <w:t>상태 관리 방식 확정 후 검토</w:t>
-            </w:r>
-          </w:p>
-        </w:tc>
-      </w:tr>
-      <w:tr>
-        <w:tc>
-          <w:tcPr>
-            <w:tcW w:type="dxa" w:w="2340"/>
-            <w:tcMar>
-              <w:top w:w="100" w:type="dxa"/>
-              <w:bottom w:w="100" w:type="dxa"/>
-              <w:left w:w="140" w:type="dxa"/>
-              <w:right w:w="140" w:type="dxa"/>
-            </w:tcMar>
-          </w:tcPr>
-          <w:p>
-            <w:pPr>
-              <w:spacing w:before="40" w:after="40"/>
-            </w:pPr>
-            <w:r>
-              <w:rPr>
-                <w:rFonts w:ascii="맑은 고딕" w:hAnsi="맑은 고딕" w:eastAsia="맑은 고딕"/>
-                <w:color w:val="334155"/>
-                <w:sz w:val="19"/>
-              </w:rPr>
-              <w:t>Figma 구현</w:t>
-            </w:r>
-          </w:p>
-        </w:tc>
-        <w:tc>
-          <w:tcPr>
-            <w:tcW w:type="dxa" w:w="2340"/>
-            <w:tcMar>
-              <w:top w:w="100" w:type="dxa"/>
-              <w:bottom w:w="100" w:type="dxa"/>
-              <w:left w:w="140" w:type="dxa"/>
-              <w:right w:w="140" w:type="dxa"/>
-            </w:tcMar>
-          </w:tcPr>
-          <w:p>
-            <w:pPr>
-              <w:spacing w:before="40" w:after="40"/>
-            </w:pPr>
-            <w:r>
-              <w:rPr>
-                <w:rFonts w:ascii="Consolas" w:hAnsi="Consolas" w:eastAsia="맑은 고딕"/>
-                <w:color w:val="B42846"/>
-                <w:sz w:val="18"/>
-              </w:rPr>
-              <w:t>figma-to-flutter</w:t>
-            </w:r>
-          </w:p>
-        </w:tc>
-        <w:tc>
-          <w:tcPr>
-            <w:tcW w:type="dxa" w:w="2340"/>
-            <w:tcMar>
-              <w:top w:w="100" w:type="dxa"/>
-              <w:bottom w:w="100" w:type="dxa"/>
-              <w:left w:w="140" w:type="dxa"/>
-              <w:right w:w="140" w:type="dxa"/>
-            </w:tcMar>
-          </w:tcPr>
-          <w:p>
-            <w:pPr>
-              <w:spacing w:before="40" w:after="40"/>
-            </w:pPr>
-            <w:r>
-              <w:rPr>
-                <w:rFonts w:ascii="맑은 고딕" w:hAnsi="맑은 고딕" w:eastAsia="맑은 고딕"/>
-                <w:color w:val="334155"/>
-                <w:sz w:val="19"/>
-              </w:rPr>
-              <w:t>Figma 디자인의 레이아웃·색상·컴포넌트를 Flutter UI로 옮기는 작업 지원</w:t>
-            </w:r>
-          </w:p>
-        </w:tc>
-        <w:tc>
-          <w:tcPr>
-            <w:tcW w:type="dxa" w:w="2340"/>
-            <w:tcMar>
-              <w:top w:w="100" w:type="dxa"/>
-              <w:bottom w:w="100" w:type="dxa"/>
-              <w:left w:w="140" w:type="dxa"/>
-              <w:right w:w="140" w:type="dxa"/>
-            </w:tcMar>
-          </w:tcPr>
-          <w:p>
-            <w:pPr>
-              <w:spacing w:before="40" w:after="40"/>
-            </w:pPr>
-            <w:r>
-              <w:rPr>
-                <w:rFonts w:ascii="맑은 고딕" w:hAnsi="맑은 고딕" w:eastAsia="맑은 고딕"/>
-                <w:color w:val="334155"/>
-                <w:sz w:val="19"/>
-              </w:rPr>
-              <w:t>화면 구현 시 검토</w:t>
-            </w:r>
-          </w:p>
-        </w:tc>
-      </w:tr>
-      <w:tr>
-        <w:tc>
-          <w:tcPr>
-            <w:tcW w:type="dxa" w:w="2340"/>
-            <w:shd w:fill="F8FAFC"/>
-            <w:tcMar>
-              <w:top w:w="100" w:type="dxa"/>
-              <w:bottom w:w="100" w:type="dxa"/>
-              <w:left w:w="140" w:type="dxa"/>
-              <w:right w:w="140" w:type="dxa"/>
-            </w:tcMar>
-          </w:tcPr>
-          <w:p>
-            <w:pPr>
-              <w:spacing w:before="40" w:after="40"/>
-            </w:pPr>
-            <w:r>
-              <w:rPr>
-                <w:rFonts w:ascii="맑은 고딕" w:hAnsi="맑은 고딕" w:eastAsia="맑은 고딕"/>
-                <w:color w:val="334155"/>
-                <w:sz w:val="19"/>
-              </w:rPr>
-              <w:t>UI/UX 규격</w:t>
+              <w:t>모바일 UI/UX</w:t>
             </w:r>
           </w:p>
         </w:tc>
@@ -12682,7 +13057,7 @@
                 <w:color w:val="334155"/>
                 <w:sz w:val="19"/>
               </w:rPr>
-              <w:t>모바일 터치 영역, 안전 영역, 플랫폼별 사용성 등 모바일 인터페이스 지침 제공</w:t>
+              <w:t>모바일 레이아웃·플랫폼 사용성 지침 후보</w:t>
             </w:r>
           </w:p>
         </w:tc>
@@ -12707,207 +13082,7 @@
                 <w:color w:val="334155"/>
                 <w:sz w:val="19"/>
               </w:rPr>
-              <w:t>검토 후 도입 후보</w:t>
-            </w:r>
-          </w:p>
-        </w:tc>
-      </w:tr>
-      <w:tr>
-        <w:tc>
-          <w:tcPr>
-            <w:tcW w:type="dxa" w:w="2340"/>
-            <w:tcMar>
-              <w:top w:w="100" w:type="dxa"/>
-              <w:bottom w:w="100" w:type="dxa"/>
-              <w:left w:w="140" w:type="dxa"/>
-              <w:right w:w="140" w:type="dxa"/>
-            </w:tcMar>
-          </w:tcPr>
-          <w:p>
-            <w:pPr>
-              <w:spacing w:before="40" w:after="40"/>
-            </w:pPr>
-            <w:r>
-              <w:rPr>
-                <w:rFonts w:ascii="맑은 고딕" w:hAnsi="맑은 고딕" w:eastAsia="맑은 고딕"/>
-                <w:color w:val="334155"/>
-                <w:sz w:val="19"/>
-              </w:rPr>
-              <w:t>접근성</w:t>
-            </w:r>
-          </w:p>
-        </w:tc>
-        <w:tc>
-          <w:tcPr>
-            <w:tcW w:type="dxa" w:w="2340"/>
-            <w:tcMar>
-              <w:top w:w="100" w:type="dxa"/>
-              <w:bottom w:w="100" w:type="dxa"/>
-              <w:left w:w="140" w:type="dxa"/>
-              <w:right w:w="140" w:type="dxa"/>
-            </w:tcMar>
-          </w:tcPr>
-          <w:p>
-            <w:pPr>
-              <w:spacing w:before="40" w:after="40"/>
-            </w:pPr>
-            <w:r>
-              <w:rPr>
-                <w:rFonts w:ascii="Consolas" w:hAnsi="Consolas" w:eastAsia="맑은 고딕"/>
-                <w:color w:val="B42846"/>
-                <w:sz w:val="18"/>
-              </w:rPr>
-              <w:t>wcag-accessible-color-contrast</w:t>
-            </w:r>
-          </w:p>
-        </w:tc>
-        <w:tc>
-          <w:tcPr>
-            <w:tcW w:type="dxa" w:w="2340"/>
-            <w:tcMar>
-              <w:top w:w="100" w:type="dxa"/>
-              <w:bottom w:w="100" w:type="dxa"/>
-              <w:left w:w="140" w:type="dxa"/>
-              <w:right w:w="140" w:type="dxa"/>
-            </w:tcMar>
-          </w:tcPr>
-          <w:p>
-            <w:pPr>
-              <w:spacing w:before="40" w:after="40"/>
-            </w:pPr>
-            <w:r>
-              <w:rPr>
-                <w:rFonts w:ascii="맑은 고딕" w:hAnsi="맑은 고딕" w:eastAsia="맑은 고딕"/>
-                <w:color w:val="334155"/>
-                <w:sz w:val="19"/>
-              </w:rPr>
-              <w:t>색상 대비와 시각적 접근성 점검 지침 제공</w:t>
-            </w:r>
-          </w:p>
-        </w:tc>
-        <w:tc>
-          <w:tcPr>
-            <w:tcW w:type="dxa" w:w="2340"/>
-            <w:tcMar>
-              <w:top w:w="100" w:type="dxa"/>
-              <w:bottom w:w="100" w:type="dxa"/>
-              <w:left w:w="140" w:type="dxa"/>
-              <w:right w:w="140" w:type="dxa"/>
-            </w:tcMar>
-          </w:tcPr>
-          <w:p>
-            <w:pPr>
-              <w:spacing w:before="40" w:after="40"/>
-            </w:pPr>
-            <w:r>
-              <w:rPr>
-                <w:rFonts w:ascii="맑은 고딕" w:hAnsi="맑은 고딕" w:eastAsia="맑은 고딕"/>
-                <w:color w:val="334155"/>
-                <w:sz w:val="19"/>
-              </w:rPr>
-              <w:t>디자인 검수 시 검토</w:t>
-            </w:r>
-          </w:p>
-        </w:tc>
-      </w:tr>
-      <w:tr>
-        <w:tc>
-          <w:tcPr>
-            <w:tcW w:type="dxa" w:w="2340"/>
-            <w:shd w:fill="F8FAFC"/>
-            <w:tcMar>
-              <w:top w:w="100" w:type="dxa"/>
-              <w:bottom w:w="100" w:type="dxa"/>
-              <w:left w:w="140" w:type="dxa"/>
-              <w:right w:w="140" w:type="dxa"/>
-            </w:tcMar>
-          </w:tcPr>
-          <w:p>
-            <w:pPr>
-              <w:spacing w:before="40" w:after="40"/>
-            </w:pPr>
-            <w:r>
-              <w:rPr>
-                <w:rFonts w:ascii="맑은 고딕" w:hAnsi="맑은 고딕" w:eastAsia="맑은 고딕"/>
-                <w:color w:val="334155"/>
-                <w:sz w:val="19"/>
-              </w:rPr>
-              <w:t>문구·빈 상태</w:t>
-            </w:r>
-          </w:p>
-        </w:tc>
-        <w:tc>
-          <w:tcPr>
-            <w:tcW w:type="dxa" w:w="2340"/>
-            <w:shd w:fill="F8FAFC"/>
-            <w:tcMar>
-              <w:top w:w="100" w:type="dxa"/>
-              <w:bottom w:w="100" w:type="dxa"/>
-              <w:left w:w="140" w:type="dxa"/>
-              <w:right w:w="140" w:type="dxa"/>
-            </w:tcMar>
-          </w:tcPr>
-          <w:p>
-            <w:pPr>
-              <w:spacing w:before="40" w:after="40"/>
-            </w:pPr>
-            <w:r>
-              <w:rPr>
-                <w:rFonts w:ascii="Consolas" w:hAnsi="Consolas" w:eastAsia="맑은 고딕"/>
-                <w:color w:val="B42846"/>
-                <w:sz w:val="18"/>
-              </w:rPr>
-              <w:t>empathetic-copywriting-and-empty-states</w:t>
-            </w:r>
-          </w:p>
-        </w:tc>
-        <w:tc>
-          <w:tcPr>
-            <w:tcW w:type="dxa" w:w="2340"/>
-            <w:shd w:fill="F8FAFC"/>
-            <w:tcMar>
-              <w:top w:w="100" w:type="dxa"/>
-              <w:bottom w:w="100" w:type="dxa"/>
-              <w:left w:w="140" w:type="dxa"/>
-              <w:right w:w="140" w:type="dxa"/>
-            </w:tcMar>
-          </w:tcPr>
-          <w:p>
-            <w:pPr>
-              <w:spacing w:before="40" w:after="40"/>
-            </w:pPr>
-            <w:r>
-              <w:rPr>
-                <w:rFonts w:ascii="맑은 고딕" w:hAnsi="맑은 고딕" w:eastAsia="맑은 고딕"/>
-                <w:color w:val="334155"/>
-                <w:sz w:val="19"/>
-              </w:rPr>
-              <w:t>비처벌적 UX 원칙에 맞는 안내 문구와 빈 화면 상태 설계 지원</w:t>
-            </w:r>
-          </w:p>
-        </w:tc>
-        <w:tc>
-          <w:tcPr>
-            <w:tcW w:type="dxa" w:w="2340"/>
-            <w:shd w:fill="F8FAFC"/>
-            <w:tcMar>
-              <w:top w:w="100" w:type="dxa"/>
-              <w:bottom w:w="100" w:type="dxa"/>
-              <w:left w:w="140" w:type="dxa"/>
-              <w:right w:w="140" w:type="dxa"/>
-            </w:tcMar>
-          </w:tcPr>
-          <w:p>
-            <w:pPr>
-              <w:spacing w:before="40" w:after="40"/>
-            </w:pPr>
-            <w:r>
-              <w:rPr>
-                <w:rFonts w:ascii="맑은 고딕" w:hAnsi="맑은 고딕" w:eastAsia="맑은 고딕"/>
-                <w:color w:val="334155"/>
-                <w:sz w:val="19"/>
-              </w:rPr>
-              <w:t>문구·상태 화면 설계 시 검토</w:t>
+              <w:t>미다운로드; 출처와 실제 내용 확인 후 재평가</w:t>
             </w:r>
           </w:p>
         </w:tc>
@@ -12981,7 +13156,7 @@
                 <w:color w:val="334155"/>
                 <w:sz w:val="19"/>
               </w:rPr>
-              <w:t>전환·피드백 애니메이션을 과하지 않고 일관되게 설계하도록 지원</w:t>
+              <w:t>상호작용 애니메이션 지침 후보</w:t>
             </w:r>
           </w:p>
         </w:tc>
@@ -13005,7 +13180,7 @@
                 <w:color w:val="334155"/>
                 <w:sz w:val="19"/>
               </w:rPr>
-              <w:t>인터랙션 구현 시 검토</w:t>
+              <w:t>미다운로드; 아래 reduced-motion 요구사항을 우선 적용</w:t>
             </w:r>
           </w:p>
         </w:tc>
@@ -13032,7 +13207,7 @@
                 <w:color w:val="334155"/>
                 <w:sz w:val="19"/>
               </w:rPr>
-              <w:t>테스트</w:t>
+              <w:t>모바일 자동화</w:t>
             </w:r>
           </w:p>
         </w:tc>
@@ -13057,7 +13232,7 @@
                 <w:color w:val="B42846"/>
                 <w:sz w:val="18"/>
               </w:rPr>
-              <w:t>flutter-test-runner</w:t>
+              <w:t>mobile-mcp</w:t>
             </w:r>
           </w:p>
         </w:tc>
@@ -13082,7 +13257,7 @@
                 <w:color w:val="334155"/>
                 <w:sz w:val="19"/>
               </w:rPr>
-              <w:t>Flutter 테스트 작성·실행 및 결과 확인 절차 지원</w:t>
+              <w:t>시뮬레이터·기기 상호작용 자동화 후보</w:t>
             </w:r>
           </w:p>
         </w:tc>
@@ -13107,7 +13282,7 @@
                 <w:color w:val="334155"/>
                 <w:sz w:val="19"/>
               </w:rPr>
-              <w:t>테스트 구성 시 검토</w:t>
+              <w:t>미다운로드; 필요한 검증 환경과 권한을 확인한 뒤 검토</w:t>
             </w:r>
           </w:p>
         </w:tc>
@@ -13133,31 +13308,7 @@
                 <w:color w:val="334155"/>
                 <w:sz w:val="19"/>
               </w:rPr>
-              <w:t>모바일 자동화</w:t>
-            </w:r>
-          </w:p>
-        </w:tc>
-        <w:tc>
-          <w:tcPr>
-            <w:tcW w:type="dxa" w:w="2340"/>
-            <w:tcMar>
-              <w:top w:w="100" w:type="dxa"/>
-              <w:bottom w:w="100" w:type="dxa"/>
-              <w:left w:w="140" w:type="dxa"/>
-              <w:right w:w="140" w:type="dxa"/>
-            </w:tcMar>
-          </w:tcPr>
-          <w:p>
-            <w:pPr>
-              <w:spacing w:before="40" w:after="40"/>
-            </w:pPr>
-            <w:r>
-              <w:rPr>
-                <w:rFonts w:ascii="Consolas" w:hAnsi="Consolas" w:eastAsia="맑은 고딕"/>
-                <w:color w:val="B42846"/>
-                <w:sz w:val="18"/>
-              </w:rPr>
-              <w:t>mobile-mcp</w:t>
+              <w:t>OCR (선택 기능)</w:t>
             </w:r>
           </w:p>
         </w:tc>
@@ -13181,7 +13332,7 @@
                 <w:color w:val="334155"/>
                 <w:sz w:val="19"/>
               </w:rPr>
-              <w:t>모바일 앱의 화면 및 동작을 자동화해 실기기·시뮬레이터 검증을 보조</w:t>
+              <w:t>OCR용 Flutter/ML Kit 지침</w:t>
             </w:r>
           </w:p>
         </w:tc>
@@ -13205,16 +13356,13 @@
                 <w:color w:val="334155"/>
                 <w:sz w:val="19"/>
               </w:rPr>
-              <w:t>사용 환경·권한 확인 후 검토</w:t>
+              <w:t>온디바이스 텍스트 인식 구현 참고</w:t>
             </w:r>
           </w:p>
         </w:tc>
-      </w:tr>
-      <w:tr>
         <w:tc>
           <w:tcPr>
             <w:tcW w:type="dxa" w:w="2340"/>
-            <w:shd w:fill="F8FAFC"/>
             <w:tcMar>
               <w:top w:w="100" w:type="dxa"/>
               <w:bottom w:w="100" w:type="dxa"/>
@@ -13232,82 +13380,7 @@
                 <w:color w:val="334155"/>
                 <w:sz w:val="19"/>
               </w:rPr>
-              <w:t>OCR (선택 기능)</w:t>
-            </w:r>
-          </w:p>
-        </w:tc>
-        <w:tc>
-          <w:tcPr>
-            <w:tcW w:type="dxa" w:w="2340"/>
-            <w:shd w:fill="F8FAFC"/>
-            <w:tcMar>
-              <w:top w:w="100" w:type="dxa"/>
-              <w:bottom w:w="100" w:type="dxa"/>
-              <w:left w:w="140" w:type="dxa"/>
-              <w:right w:w="140" w:type="dxa"/>
-            </w:tcMar>
-          </w:tcPr>
-          <w:p>
-            <w:pPr>
-              <w:spacing w:before="40" w:after="40"/>
-            </w:pPr>
-            <w:r>
-              <w:rPr>
-                <w:rFonts w:ascii="Consolas" w:hAnsi="Consolas" w:eastAsia="맑은 고딕"/>
-                <w:color w:val="B42846"/>
-                <w:sz w:val="18"/>
-              </w:rPr>
-              <w:t>google-mlkit-flutter-recipes</w:t>
-            </w:r>
-          </w:p>
-        </w:tc>
-        <w:tc>
-          <w:tcPr>
-            <w:tcW w:type="dxa" w:w="2340"/>
-            <w:shd w:fill="F8FAFC"/>
-            <w:tcMar>
-              <w:top w:w="100" w:type="dxa"/>
-              <w:bottom w:w="100" w:type="dxa"/>
-              <w:left w:w="140" w:type="dxa"/>
-              <w:right w:w="140" w:type="dxa"/>
-            </w:tcMar>
-          </w:tcPr>
-          <w:p>
-            <w:pPr>
-              <w:spacing w:before="40" w:after="40"/>
-            </w:pPr>
-            <w:r>
-              <w:rPr>
-                <w:rFonts w:ascii="맑은 고딕" w:hAnsi="맑은 고딕" w:eastAsia="맑은 고딕"/>
-                <w:color w:val="334155"/>
-                <w:sz w:val="19"/>
-              </w:rPr>
-              <w:t>Google ML Kit을 이용한 Flutter 온디바이스 텍스트 인식 구현 참고 지침</w:t>
-            </w:r>
-          </w:p>
-        </w:tc>
-        <w:tc>
-          <w:tcPr>
-            <w:tcW w:type="dxa" w:w="2340"/>
-            <w:shd w:fill="F8FAFC"/>
-            <w:tcMar>
-              <w:top w:w="100" w:type="dxa"/>
-              <w:bottom w:w="100" w:type="dxa"/>
-              <w:left w:w="140" w:type="dxa"/>
-              <w:right w:w="140" w:type="dxa"/>
-            </w:tcMar>
-          </w:tcPr>
-          <w:p>
-            <w:pPr>
-              <w:spacing w:before="40" w:after="40"/>
-            </w:pPr>
-            <w:r>
-              <w:rPr>
-                <w:rFonts w:ascii="맑은 고딕" w:hAnsi="맑은 고딕" w:eastAsia="맑은 고딕"/>
-                <w:color w:val="334155"/>
-                <w:sz w:val="19"/>
-              </w:rPr>
-              <w:t>약봉투 OCR 도입 여부 결정 전까지 보류</w:t>
+              <w:t>OCR 기능 채택 결정 전까지 보류; 구체적인 출처가 검증된 스킬만 추가</w:t>
             </w:r>
           </w:p>
         </w:tc>
@@ -13330,7 +13403,7 @@
           <w:color w:val="2563EB"/>
           <w:sz w:val="24"/>
         </w:rPr>
-        <w:t>도입 원칙</w:t>
+        <w:t>자연스러운 앱 문구 및 문서 작성 원칙</w:t>
       </w:r>
     </w:p>
     <w:p>
@@ -13350,10 +13423,66 @@
       <w:r>
         <w:rPr>
           <w:rFonts w:ascii="맑은 고딕" w:hAnsi="맑은 고딕" w:eastAsia="맑은 고딕"/>
-          <w:color w:val="334155"/>
-          <w:sz w:val="20"/>
-        </w:rPr>
-        <w:t xml:space="preserve">기존 개발환경과 프로젝트의 </w:t>
+          <w:b/>
+          <w:color w:val="334155"/>
+          <w:sz w:val="20"/>
+        </w:rPr>
+        <w:t>앱 문구</w:t>
+      </w:r>
+      <w:r>
+        <w:rPr>
+          <w:rFonts w:ascii="맑은 고딕" w:hAnsi="맑은 고딕" w:eastAsia="맑은 고딕"/>
+          <w:color w:val="334155"/>
+          <w:sz w:val="20"/>
+        </w:rPr>
+        <w:t>는 짧고 이해하기 쉬운 한국어로 작성하며, 사용자의 복약 누락이나 습관 미실천을 실패·잘못으로 표현하지 않음. 친근함은 유지하되 과장된 칭찬, 불필요한 감탄, 죄책감 유발 표현은 피함.</w:t>
+      </w:r>
+    </w:p>
+    <w:p>
+      <w:pPr>
+        <w:spacing w:before="30" w:after="30"/>
+        <w:ind w:left="360"/>
+      </w:pPr>
+      <w:r>
+        <w:rPr>
+          <w:rFonts w:ascii="맑은 고딕" w:hAnsi="맑은 고딕"/>
+          <w:b/>
+          <w:color w:val="6366F1"/>
+          <w:sz w:val="20"/>
+        </w:rPr>
+        <w:t xml:space="preserve">• </w:t>
+      </w:r>
+      <w:r>
+        <w:rPr>
+          <w:rFonts w:ascii="맑은 고딕" w:hAnsi="맑은 고딕" w:eastAsia="맑은 고딕"/>
+          <w:b/>
+          <w:color w:val="334155"/>
+          <w:sz w:val="20"/>
+        </w:rPr>
+        <w:t>기획서·보고서</w:t>
+      </w:r>
+      <w:r>
+        <w:rPr>
+          <w:rFonts w:ascii="맑은 고딕" w:hAnsi="맑은 고딕" w:eastAsia="맑은 고딕"/>
+          <w:color w:val="334155"/>
+          <w:sz w:val="20"/>
+        </w:rPr>
+        <w:t>는 문서의 독자와 목적에 맞는 말투를 사용함. 상투적인 도입·결론, 반복 요약, 불필요한 수식어를 줄이고 문장 길이를 자연스럽게 조절함.</w:t>
+      </w:r>
+    </w:p>
+    <w:p>
+      <w:pPr>
+        <w:spacing w:before="30" w:after="30"/>
+        <w:ind w:left="360"/>
+      </w:pPr>
+      <w:r>
+        <w:rPr>
+          <w:rFonts w:ascii="맑은 고딕" w:hAnsi="맑은 고딕"/>
+          <w:b/>
+          <w:color w:val="6366F1"/>
+          <w:sz w:val="20"/>
+        </w:rPr>
+        <w:t xml:space="preserve">• </w:t>
       </w:r>
       <w:r>
         <w:rPr>
@@ -13361,19 +13490,34 @@
           <w:color w:val="B42846"/>
           <w:sz w:val="19"/>
         </w:rPr>
-        <w:t>AGENTS.md</w:t>
-      </w:r>
-      <w:r>
-        <w:rPr>
-          <w:rFonts w:ascii="맑은 고딕" w:hAnsi="맑은 고딕" w:eastAsia="맑은 고딕"/>
-          <w:color w:val="334155"/>
-          <w:sz w:val="20"/>
-        </w:rPr>
-        <w:t>/스킬 규칙을 우선 확인하고, 중복되거나 충돌하는 지침은 추가하지 않음.</w:t>
+        <w:t>humanizer</w:t>
+      </w:r>
+      <w:r>
+        <w:rPr>
+          <w:rFonts w:ascii="맑은 고딕" w:hAnsi="맑은 고딕" w:eastAsia="맑은 고딕"/>
+          <w:color w:val="334155"/>
+          <w:sz w:val="20"/>
+        </w:rPr>
+        <w:t>는 문서 산문을 다듬는 보조 도구로만 사용함. 학술·약학적 사실, 수치, 인용, 출처, 불확실성, 요구사항은 임의로 추가·삭제·변경하지 않으며, 편집 뒤 원문과 대조해 확인함. 코드, 명령어, YAML, 데이터 표의 값은 문체 편집 대상으로 삼지 않음.</w:t>
       </w:r>
     </w:p>
     <w:p>
       <w:pPr>
+        <w:keepNext/>
+        <w:spacing w:before="220" w:after="80"/>
+      </w:pPr>
+      <w:r>
+        <w:rPr>
+          <w:rFonts w:ascii="맑은 고딕" w:hAnsi="맑은 고딕" w:eastAsia="맑은 고딕"/>
+          <w:b/>
+          <w:color w:val="2563EB"/>
+          <w:sz w:val="24"/>
+        </w:rPr>
+        <w:t>접근성 요구사항</w:t>
+      </w:r>
+    </w:p>
+    <w:p>
+      <w:pPr>
         <w:spacing w:before="30" w:after="30"/>
         <w:ind w:left="360"/>
       </w:pPr>
@@ -13392,7 +13536,227 @@
           <w:color w:val="334155"/>
           <w:sz w:val="20"/>
         </w:rPr>
-        <w:t>각 후보의 실제 배포처·라이선스·변경 이력과 포함 파일을 확인한 뒤 필요한 항목만 선택함. 이름이나 소개만으로 저작권·보안 안전성을 단정하지 않음.</w:t>
+        <w:t xml:space="preserve">주요 버튼과 조작 요소의 터치 영역은 최소 </w:t>
+      </w:r>
+      <w:r>
+        <w:rPr>
+          <w:rFonts w:ascii="맑은 고딕" w:hAnsi="맑은 고딕" w:eastAsia="맑은 고딕"/>
+          <w:b/>
+          <w:color w:val="334155"/>
+          <w:sz w:val="20"/>
+        </w:rPr>
+        <w:t>48×48 dp</w:t>
+      </w:r>
+      <w:r>
+        <w:rPr>
+          <w:rFonts w:ascii="맑은 고딕" w:hAnsi="맑은 고딕" w:eastAsia="맑은 고딕"/>
+          <w:color w:val="334155"/>
+          <w:sz w:val="20"/>
+        </w:rPr>
+        <w:t>로 하며, 상태를 색상만으로 전달하지 않고 아이콘·라벨 등 비색상 단서를 함께 제공함.</w:t>
+      </w:r>
+    </w:p>
+    <w:p>
+      <w:pPr>
+        <w:spacing w:before="30" w:after="30"/>
+        <w:ind w:left="360"/>
+      </w:pPr>
+      <w:r>
+        <w:rPr>
+          <w:rFonts w:ascii="맑은 고딕" w:hAnsi="맑은 고딕"/>
+          <w:b/>
+          <w:color w:val="6366F1"/>
+          <w:sz w:val="20"/>
+        </w:rPr>
+        <w:t xml:space="preserve">• </w:t>
+      </w:r>
+      <w:r>
+        <w:rPr>
+          <w:rFonts w:ascii="맑은 고딕" w:hAnsi="맑은 고딕" w:eastAsia="맑은 고딕"/>
+          <w:color w:val="334155"/>
+          <w:sz w:val="20"/>
+        </w:rPr>
+        <w:t>아이콘과 이미지에는 화면 읽기 도구가 이해할 수 있는 의미 라벨을 제공하거나 장식 요소임을 명시함. TalkBack·VoiceOver에서 버튼 역할과 상태가 식별되어야 함.</w:t>
+      </w:r>
+    </w:p>
+    <w:p>
+      <w:pPr>
+        <w:spacing w:before="30" w:after="30"/>
+        <w:ind w:left="360"/>
+      </w:pPr>
+      <w:r>
+        <w:rPr>
+          <w:rFonts w:ascii="맑은 고딕" w:hAnsi="맑은 고딕"/>
+          <w:b/>
+          <w:color w:val="6366F1"/>
+          <w:sz w:val="20"/>
+        </w:rPr>
+        <w:t xml:space="preserve">• </w:t>
+      </w:r>
+      <w:r>
+        <w:rPr>
+          <w:rFonts w:ascii="맑은 고딕" w:hAnsi="맑은 고딕" w:eastAsia="맑은 고딕"/>
+          <w:color w:val="334155"/>
+          <w:sz w:val="20"/>
+        </w:rPr>
+        <w:t>사용자가 시스템 글자 크기를 키워도 핵심 문구나 조작 요소가 잘리거나 숨겨지지 않게 함. 애니메이션 감소 설정을 존중함.</w:t>
+      </w:r>
+    </w:p>
+    <w:p>
+      <w:pPr>
+        <w:spacing w:before="30" w:after="30"/>
+        <w:ind w:left="360"/>
+      </w:pPr>
+      <w:r>
+        <w:rPr>
+          <w:rFonts w:ascii="맑은 고딕" w:hAnsi="맑은 고딕"/>
+          <w:b/>
+          <w:color w:val="6366F1"/>
+          <w:sz w:val="20"/>
+        </w:rPr>
+        <w:t xml:space="preserve">• </w:t>
+      </w:r>
+      <w:r>
+        <w:rPr>
+          <w:rFonts w:ascii="맑은 고딕" w:hAnsi="맑은 고딕" w:eastAsia="맑은 고딕"/>
+          <w:color w:val="334155"/>
+          <w:sz w:val="20"/>
+        </w:rPr>
+        <w:t xml:space="preserve">일반 텍스트 대비는 WCAG AA 기준 </w:t>
+      </w:r>
+      <w:r>
+        <w:rPr>
+          <w:rFonts w:ascii="맑은 고딕" w:hAnsi="맑은 고딕" w:eastAsia="맑은 고딕"/>
+          <w:b/>
+          <w:color w:val="334155"/>
+          <w:sz w:val="20"/>
+        </w:rPr>
+        <w:t>4.5:1 이상</w:t>
+      </w:r>
+      <w:r>
+        <w:rPr>
+          <w:rFonts w:ascii="맑은 고딕" w:hAnsi="맑은 고딕" w:eastAsia="맑은 고딕"/>
+          <w:color w:val="334155"/>
+          <w:sz w:val="20"/>
+        </w:rPr>
+        <w:t xml:space="preserve">, 큰 텍스트는 </w:t>
+      </w:r>
+      <w:r>
+        <w:rPr>
+          <w:rFonts w:ascii="맑은 고딕" w:hAnsi="맑은 고딕" w:eastAsia="맑은 고딕"/>
+          <w:b/>
+          <w:color w:val="334155"/>
+          <w:sz w:val="20"/>
+        </w:rPr>
+        <w:t>3:1 이상</w:t>
+      </w:r>
+      <w:r>
+        <w:rPr>
+          <w:rFonts w:ascii="맑은 고딕" w:hAnsi="맑은 고딕" w:eastAsia="맑은 고딕"/>
+          <w:color w:val="334155"/>
+          <w:sz w:val="20"/>
+        </w:rPr>
+        <w:t>을 목표로 하고, 색상이 합성된 실제 배경 기준으로 검증함.</w:t>
+      </w:r>
+    </w:p>
+    <w:p>
+      <w:pPr>
+        <w:spacing w:before="30" w:after="30"/>
+        <w:ind w:left="360"/>
+      </w:pPr>
+      <w:r>
+        <w:rPr>
+          <w:rFonts w:ascii="맑은 고딕" w:hAnsi="맑은 고딕"/>
+          <w:b/>
+          <w:color w:val="6366F1"/>
+          <w:sz w:val="20"/>
+        </w:rPr>
+        <w:t xml:space="preserve">• </w:t>
+      </w:r>
+      <w:r>
+        <w:rPr>
+          <w:rFonts w:ascii="맑은 고딕" w:hAnsi="맑은 고딕" w:eastAsia="맑은 고딕"/>
+          <w:color w:val="334155"/>
+          <w:sz w:val="20"/>
+        </w:rPr>
+        <w:t>접근성 검수 시 주요 화면을 글자 확대, 회색조, 애니메이션 감소 설정에서 확인하고, Android TalkBack 및 iOS VoiceOver로 핵심 흐름을 점검함.</w:t>
+      </w:r>
+    </w:p>
+    <w:p>
+      <w:pPr>
+        <w:keepNext/>
+        <w:spacing w:before="220" w:after="80"/>
+      </w:pPr>
+      <w:r>
+        <w:rPr>
+          <w:rFonts w:ascii="맑은 고딕" w:hAnsi="맑은 고딕" w:eastAsia="맑은 고딕"/>
+          <w:b/>
+          <w:color w:val="2563EB"/>
+          <w:sz w:val="24"/>
+        </w:rPr>
+        <w:t>도입 원칙</w:t>
+      </w:r>
+    </w:p>
+    <w:p>
+      <w:pPr>
+        <w:spacing w:before="30" w:after="30"/>
+        <w:ind w:left="360"/>
+      </w:pPr>
+      <w:r>
+        <w:rPr>
+          <w:rFonts w:ascii="맑은 고딕" w:hAnsi="맑은 고딕"/>
+          <w:b/>
+          <w:color w:val="6366F1"/>
+          <w:sz w:val="20"/>
+        </w:rPr>
+        <w:t xml:space="preserve">• </w:t>
+      </w:r>
+      <w:r>
+        <w:rPr>
+          <w:rFonts w:ascii="맑은 고딕" w:hAnsi="맑은 고딕" w:eastAsia="맑은 고딕"/>
+          <w:color w:val="334155"/>
+          <w:sz w:val="20"/>
+        </w:rPr>
+        <w:t xml:space="preserve">기존 개발환경과 프로젝트의 </w:t>
+      </w:r>
+      <w:r>
+        <w:rPr>
+          <w:rFonts w:ascii="Consolas" w:hAnsi="Consolas" w:eastAsia="맑은 고딕"/>
+          <w:color w:val="B42846"/>
+          <w:sz w:val="19"/>
+        </w:rPr>
+        <w:t>AGENTS.md</w:t>
+      </w:r>
+      <w:r>
+        <w:rPr>
+          <w:rFonts w:ascii="맑은 고딕" w:hAnsi="맑은 고딕" w:eastAsia="맑은 고딕"/>
+          <w:color w:val="334155"/>
+          <w:sz w:val="20"/>
+        </w:rPr>
+        <w:t>/스킬 규칙을 우선 확인하고, 중복되거나 충돌하는 지침은 추가하지 않음.</w:t>
+      </w:r>
+    </w:p>
+    <w:p>
+      <w:pPr>
+        <w:spacing w:before="30" w:after="30"/>
+        <w:ind w:left="360"/>
+      </w:pPr>
+      <w:r>
+        <w:rPr>
+          <w:rFonts w:ascii="맑은 고딕" w:hAnsi="맑은 고딕"/>
+          <w:b/>
+          <w:color w:val="6366F1"/>
+          <w:sz w:val="20"/>
+        </w:rPr>
+        <w:t xml:space="preserve">• </w:t>
+      </w:r>
+      <w:r>
+        <w:rPr>
+          <w:rFonts w:ascii="맑은 고딕" w:hAnsi="맑은 고딕" w:eastAsia="맑은 고딕"/>
+          <w:color w:val="334155"/>
+          <w:sz w:val="20"/>
+        </w:rPr>
+        <w:t>각 다운로드 스킬의 출처·라이선스와 저장소의 보안·유지보수 상태를 확인함. 이름이나 소개만으로 저작권·보안 안전성을 단정하지 않음.</w:t>
       </w:r>
     </w:p>
     <w:p>

</xml_diff>